<commit_message>
Update requirements per mentor meeting: STEP-only, visual report, mandatory review
Reflects three decisions from today's meeting with HP mentor:
- STEP is the only supported CAD format; NX support removed from
  scope entirely (was previously a lower-priority Want).
- The comparison report is visual (before/after geometry) only; no
  text summary is required.
- Engineer review is mandatory for every result, not just
  low-confidence ones, since the tool is meant to speed up work
  rather than replace engineer judgment. This resolves the earlier
  open question about confidence-threshold-based human review.

Updated FRD/NFRD (bumped to v1.1) and architecture.md (added a
mandatory Engineer Review step after the visual comparison report,
noted geometry healing happens inside the Feature Removal Engine).
</commit_message>
<xml_diff>
--- a/docs/Functional_Requirements_Document.docx
+++ b/docs/Functional_Requirements_Document.docx
@@ -361,6 +361,136 @@
           </w:p>
         </w:tc>
       </w:tr>
+      <w:tr>
+        <w:tc>
+          <w:tcPr>
+            <w:tcW w:type="dxa" w:w="2059"/>
+            <w:tcBorders>
+              <w:top w:val="single" w:color="000000" w:sz="4"/>
+              <w:left w:val="single" w:color="000000" w:sz="4"/>
+              <w:bottom w:val="single" w:color="000000" w:sz="4"/>
+              <w:right w:val="single" w:color="000000" w:sz="4"/>
+            </w:tcBorders>
+            <w:tcMar>
+              <w:top w:type="dxa" w:w="80"/>
+              <w:left w:type="dxa" w:w="100"/>
+              <w:bottom w:type="dxa" w:w="80"/>
+              <w:right w:type="dxa" w:w="100"/>
+            </w:tcMar>
+            <w:vAlign w:val="center"/>
+          </w:tcPr>
+          <w:p>
+            <w:pPr>
+              <w:jc w:val="left"/>
+            </w:pPr>
+            <w:r>
+              <w:rPr>
+                <w:b w:val="false"/>
+                <w:bCs w:val="false"/>
+                <w:sz w:val="20"/>
+                <w:szCs w:val="20"/>
+              </w:rPr>
+              <w:t xml:space="preserve">Junoh Lee</w:t>
+            </w:r>
+          </w:p>
+        </w:tc>
+        <w:tc>
+          <w:tcPr>
+            <w:tcW w:type="dxa" w:w="1684"/>
+            <w:tcBorders>
+              <w:top w:val="single" w:color="000000" w:sz="4"/>
+              <w:left w:val="single" w:color="000000" w:sz="4"/>
+              <w:bottom w:val="single" w:color="000000" w:sz="4"/>
+              <w:right w:val="single" w:color="000000" w:sz="4"/>
+            </w:tcBorders>
+            <w:tcMar>
+              <w:top w:type="dxa" w:w="80"/>
+              <w:left w:type="dxa" w:w="100"/>
+              <w:bottom w:type="dxa" w:w="80"/>
+              <w:right w:type="dxa" w:w="100"/>
+            </w:tcMar>
+            <w:vAlign w:val="center"/>
+          </w:tcPr>
+          <w:p>
+            <w:pPr>
+              <w:jc w:val="left"/>
+            </w:pPr>
+            <w:r>
+              <w:rPr>
+                <w:b w:val="false"/>
+                <w:bCs w:val="false"/>
+                <w:sz w:val="20"/>
+                <w:szCs w:val="20"/>
+              </w:rPr>
+              <w:t xml:space="preserve">2026-09-11</w:t>
+            </w:r>
+          </w:p>
+        </w:tc>
+        <w:tc>
+          <w:tcPr>
+            <w:tcW w:type="dxa" w:w="3931"/>
+            <w:tcBorders>
+              <w:top w:val="single" w:color="000000" w:sz="4"/>
+              <w:left w:val="single" w:color="000000" w:sz="4"/>
+              <w:bottom w:val="single" w:color="000000" w:sz="4"/>
+              <w:right w:val="single" w:color="000000" w:sz="4"/>
+            </w:tcBorders>
+            <w:tcMar>
+              <w:top w:type="dxa" w:w="80"/>
+              <w:left w:type="dxa" w:w="100"/>
+              <w:bottom w:type="dxa" w:w="80"/>
+              <w:right w:type="dxa" w:w="100"/>
+            </w:tcMar>
+            <w:vAlign w:val="center"/>
+          </w:tcPr>
+          <w:p>
+            <w:pPr>
+              <w:jc w:val="left"/>
+            </w:pPr>
+            <w:r>
+              <w:rPr>
+                <w:b w:val="false"/>
+                <w:bCs w:val="false"/>
+                <w:sz w:val="20"/>
+                <w:szCs w:val="20"/>
+              </w:rPr>
+              <w:t xml:space="preserve">Updated per mentor meeting: STEP-only, visual-only comparison report, mandatory engineer review</w:t>
+            </w:r>
+          </w:p>
+        </w:tc>
+        <w:tc>
+          <w:tcPr>
+            <w:tcW w:type="dxa" w:w="1684"/>
+            <w:tcBorders>
+              <w:top w:val="single" w:color="000000" w:sz="4"/>
+              <w:left w:val="single" w:color="000000" w:sz="4"/>
+              <w:bottom w:val="single" w:color="000000" w:sz="4"/>
+              <w:right w:val="single" w:color="000000" w:sz="4"/>
+            </w:tcBorders>
+            <w:tcMar>
+              <w:top w:type="dxa" w:w="80"/>
+              <w:left w:type="dxa" w:w="100"/>
+              <w:bottom w:type="dxa" w:w="80"/>
+              <w:right w:type="dxa" w:w="100"/>
+            </w:tcMar>
+            <w:vAlign w:val="center"/>
+          </w:tcPr>
+          <w:p>
+            <w:pPr>
+              <w:jc w:val="center"/>
+            </w:pPr>
+            <w:r>
+              <w:rPr>
+                <w:b w:val="false"/>
+                <w:bCs w:val="false"/>
+                <w:sz w:val="20"/>
+                <w:szCs w:val="20"/>
+              </w:rPr>
+              <w:t xml:space="preserve">1.1</w:t>
+            </w:r>
+          </w:p>
+        </w:tc>
+      </w:tr>
     </w:tbl>
     <w:p>
       <w:pPr>
@@ -995,7 +1125,7 @@
                 <w:sz w:val="20"/>
                 <w:szCs w:val="20"/>
               </w:rPr>
-              <w:t xml:space="preserve">The system should support NX-format CAD files as an additional input/output format.</w:t>
+              <w:t xml:space="preserve">The system shall use STEP as its only supported CAD format; NX-format support is out of scope.</w:t>
             </w:r>
           </w:p>
         </w:tc>
@@ -1027,7 +1157,7 @@
                 <w:sz w:val="20"/>
                 <w:szCs w:val="20"/>
               </w:rPr>
-              <w:t xml:space="preserve">Want</w:t>
+              <w:t xml:space="preserve">Must</w:t>
             </w:r>
           </w:p>
         </w:tc>
@@ -1059,7 +1189,7 @@
                 <w:sz w:val="20"/>
                 <w:szCs w:val="20"/>
               </w:rPr>
-              <w:t xml:space="preserve">Not required — HP confirmed OCCT-based tooling replaces NX</w:t>
+              <w:t xml:space="preserve">Confirmed with HP mentor (2026-09): STEP only</w:t>
             </w:r>
           </w:p>
         </w:tc>
@@ -1814,7 +1944,7 @@
                 <w:sz w:val="20"/>
                 <w:szCs w:val="20"/>
               </w:rPr>
-              <w:t xml:space="preserve">When classification confidence is below a defined threshold, the system should flag the feature for manual review instead of removing it automatically.</w:t>
+              <w:t xml:space="preserve">The system shall present all proposed feature-removal decisions to the engineer for review before finalizing the output; the system assists but does not replace engineer judgment.</w:t>
             </w:r>
           </w:p>
         </w:tc>
@@ -1846,7 +1976,7 @@
                 <w:sz w:val="20"/>
                 <w:szCs w:val="20"/>
               </w:rPr>
-              <w:t xml:space="preserve">Want</w:t>
+              <w:t xml:space="preserve">Must</w:t>
             </w:r>
           </w:p>
         </w:tc>
@@ -1878,7 +2008,7 @@
                 <w:sz w:val="20"/>
                 <w:szCs w:val="20"/>
               </w:rPr>
-              <w:t xml:space="preserve">Human-in-the-loop policy pending team/mentor decision</w:t>
+              <w:t xml:space="preserve">Confirmed with HP mentor (2026-09): the tool speeds up work, engineer review is unavoidable for every result, not only low-confidence cases</w:t>
             </w:r>
           </w:p>
         </w:tc>
@@ -2802,7 +2932,7 @@
                 <w:sz w:val="20"/>
                 <w:szCs w:val="20"/>
               </w:rPr>
-              <w:t xml:space="preserve">The system shall generate a comparison report between the original and defeatured CAD models.</w:t>
+              <w:t xml:space="preserve">The system shall generate a comparison report between the original and defeatured CAD models, for the engineer to review before accepting the result.</w:t>
             </w:r>
           </w:p>
         </w:tc>
@@ -2932,7 +3062,7 @@
                 <w:sz w:val="20"/>
                 <w:szCs w:val="20"/>
               </w:rPr>
-              <w:t xml:space="preserve">The comparison report shall include a text summary of removed features (e.g., feature type and count).</w:t>
+              <w:t xml:space="preserve">The comparison report shall be visual: a side-by-side (or before/after) rendering of the original and defeatured geometry. No text-only summary is required.</w:t>
             </w:r>
           </w:p>
         </w:tc>
@@ -2996,7 +3126,7 @@
                 <w:sz w:val="20"/>
                 <w:szCs w:val="20"/>
               </w:rPr>
-              <w:t xml:space="preserve"/>
+              <w:t xml:space="preserve">Confirmed with HP mentor (2026-09): visual before/after only, not a text summary</w:t>
             </w:r>
           </w:p>
         </w:tc>
@@ -3062,7 +3192,7 @@
                 <w:sz w:val="20"/>
                 <w:szCs w:val="20"/>
               </w:rPr>
-              <w:t xml:space="preserve">The comparison report should include a visual (image-based) before/after comparison of the geometry.</w:t>
+              <w:t xml:space="preserve">The system shall evaluate mesh quality (e.g., element count, generation time) of the original and defeatured models to measure processing-time improvement.</w:t>
             </w:r>
           </w:p>
         </w:tc>
@@ -3094,7 +3224,7 @@
                 <w:sz w:val="20"/>
                 <w:szCs w:val="20"/>
               </w:rPr>
-              <w:t xml:space="preserve">Want</w:t>
+              <w:t xml:space="preserve">Must</w:t>
             </w:r>
           </w:p>
         </w:tc>
@@ -3126,7 +3256,7 @@
                 <w:sz w:val="20"/>
                 <w:szCs w:val="20"/>
               </w:rPr>
-              <w:t xml:space="preserve">Report format (text vs. visual vs. both) pending team decision</w:t>
+              <w:t xml:space="preserve">Success criterion: 70–90% preprocessing time reduction</w:t>
             </w:r>
           </w:p>
         </w:tc>
@@ -3161,136 +3291,6 @@
                 <w:szCs w:val="20"/>
               </w:rPr>
               <w:t xml:space="preserve">FR-VAL-04</w:t>
-            </w:r>
-          </w:p>
-        </w:tc>
-        <w:tc>
-          <w:tcPr>
-            <w:tcW w:type="dxa" w:w="4024"/>
-            <w:tcBorders>
-              <w:top w:val="single" w:color="000000" w:sz="4"/>
-              <w:left w:val="single" w:color="000000" w:sz="4"/>
-              <w:bottom w:val="single" w:color="000000" w:sz="4"/>
-              <w:right w:val="single" w:color="000000" w:sz="4"/>
-            </w:tcBorders>
-            <w:tcMar>
-              <w:top w:type="dxa" w:w="80"/>
-              <w:left w:type="dxa" w:w="100"/>
-              <w:bottom w:type="dxa" w:w="80"/>
-              <w:right w:type="dxa" w:w="100"/>
-            </w:tcMar>
-            <w:vAlign w:val="center"/>
-          </w:tcPr>
-          <w:p>
-            <w:pPr>
-              <w:jc w:val="left"/>
-            </w:pPr>
-            <w:r>
-              <w:rPr>
-                <w:b w:val="false"/>
-                <w:bCs w:val="false"/>
-                <w:sz w:val="20"/>
-                <w:szCs w:val="20"/>
-              </w:rPr>
-              <w:t xml:space="preserve">The system shall evaluate mesh quality (e.g., element count, generation time) of the original and defeatured models to measure processing-time improvement.</w:t>
-            </w:r>
-          </w:p>
-        </w:tc>
-        <w:tc>
-          <w:tcPr>
-            <w:tcW w:type="dxa" w:w="1404"/>
-            <w:tcBorders>
-              <w:top w:val="single" w:color="000000" w:sz="4"/>
-              <w:left w:val="single" w:color="000000" w:sz="4"/>
-              <w:bottom w:val="single" w:color="000000" w:sz="4"/>
-              <w:right w:val="single" w:color="000000" w:sz="4"/>
-            </w:tcBorders>
-            <w:tcMar>
-              <w:top w:type="dxa" w:w="80"/>
-              <w:left w:type="dxa" w:w="100"/>
-              <w:bottom w:type="dxa" w:w="80"/>
-              <w:right w:type="dxa" w:w="100"/>
-            </w:tcMar>
-            <w:vAlign w:val="center"/>
-          </w:tcPr>
-          <w:p>
-            <w:pPr>
-              <w:jc w:val="center"/>
-            </w:pPr>
-            <w:r>
-              <w:rPr>
-                <w:b w:val="false"/>
-                <w:bCs w:val="false"/>
-                <w:sz w:val="20"/>
-                <w:szCs w:val="20"/>
-              </w:rPr>
-              <w:t xml:space="preserve">Must</w:t>
-            </w:r>
-          </w:p>
-        </w:tc>
-        <w:tc>
-          <w:tcPr>
-            <w:tcW w:type="dxa" w:w="1872"/>
-            <w:tcBorders>
-              <w:top w:val="single" w:color="000000" w:sz="4"/>
-              <w:left w:val="single" w:color="000000" w:sz="4"/>
-              <w:bottom w:val="single" w:color="000000" w:sz="4"/>
-              <w:right w:val="single" w:color="000000" w:sz="4"/>
-            </w:tcBorders>
-            <w:tcMar>
-              <w:top w:type="dxa" w:w="80"/>
-              <w:left w:type="dxa" w:w="100"/>
-              <w:bottom w:type="dxa" w:w="80"/>
-              <w:right w:type="dxa" w:w="100"/>
-            </w:tcMar>
-            <w:vAlign w:val="center"/>
-          </w:tcPr>
-          <w:p>
-            <w:pPr>
-              <w:jc w:val="left"/>
-            </w:pPr>
-            <w:r>
-              <w:rPr>
-                <w:b w:val="false"/>
-                <w:bCs w:val="false"/>
-                <w:sz w:val="20"/>
-                <w:szCs w:val="20"/>
-              </w:rPr>
-              <w:t xml:space="preserve">Success criterion: 70–90% preprocessing time reduction</w:t>
-            </w:r>
-          </w:p>
-        </w:tc>
-      </w:tr>
-      <w:tr>
-        <w:tc>
-          <w:tcPr>
-            <w:tcW w:type="dxa" w:w="2059"/>
-            <w:tcBorders>
-              <w:top w:val="single" w:color="000000" w:sz="4"/>
-              <w:left w:val="single" w:color="000000" w:sz="4"/>
-              <w:bottom w:val="single" w:color="000000" w:sz="4"/>
-              <w:right w:val="single" w:color="000000" w:sz="4"/>
-            </w:tcBorders>
-            <w:tcMar>
-              <w:top w:type="dxa" w:w="80"/>
-              <w:left w:type="dxa" w:w="100"/>
-              <w:bottom w:type="dxa" w:w="80"/>
-              <w:right w:type="dxa" w:w="100"/>
-            </w:tcMar>
-            <w:vAlign w:val="center"/>
-          </w:tcPr>
-          <w:p>
-            <w:pPr>
-              <w:jc w:val="left"/>
-            </w:pPr>
-            <w:r>
-              <w:rPr>
-                <w:b w:val="false"/>
-                <w:bCs w:val="false"/>
-                <w:sz w:val="20"/>
-                <w:szCs w:val="20"/>
-              </w:rPr>
-              <w:t xml:space="preserve">FR-VAL-05</w:t>
             </w:r>
           </w:p>
         </w:tc>

</xml_diff>

<commit_message>
FRD v1.2: incorporate wording from teammate's independent FR draft
A teammate wrote their own FR list covering the same pipeline;
cross-checked it against ours. Two of their items (NX as secondary
input, minimal/zero manual intervention) contradict decisions from
today's mentor meeting (STEP-only, mandatory engineer review) and
were intentionally not adopted. Two phrasing improvements were
merged in: "watertight" as the explicit target of geometry healing
(FR-DEF-02, and the matching architecture.md row), and explicit
prioritization of minimizing downstream CAE analysis accuracy impact
in feature classification (FR-FEAT-03).
</commit_message>
<xml_diff>
--- a/docs/Functional_Requirements_Document.docx
+++ b/docs/Functional_Requirements_Document.docx
@@ -491,6 +491,136 @@
           </w:p>
         </w:tc>
       </w:tr>
+      <w:tr>
+        <w:tc>
+          <w:tcPr>
+            <w:tcW w:type="dxa" w:w="2059"/>
+            <w:tcBorders>
+              <w:top w:val="single" w:color="000000" w:sz="4"/>
+              <w:left w:val="single" w:color="000000" w:sz="4"/>
+              <w:bottom w:val="single" w:color="000000" w:sz="4"/>
+              <w:right w:val="single" w:color="000000" w:sz="4"/>
+            </w:tcBorders>
+            <w:tcMar>
+              <w:top w:type="dxa" w:w="80"/>
+              <w:left w:type="dxa" w:w="100"/>
+              <w:bottom w:type="dxa" w:w="80"/>
+              <w:right w:type="dxa" w:w="100"/>
+            </w:tcMar>
+            <w:vAlign w:val="center"/>
+          </w:tcPr>
+          <w:p>
+            <w:pPr>
+              <w:jc w:val="left"/>
+            </w:pPr>
+            <w:r>
+              <w:rPr>
+                <w:b w:val="false"/>
+                <w:bCs w:val="false"/>
+                <w:sz w:val="20"/>
+                <w:szCs w:val="20"/>
+              </w:rPr>
+              <w:t xml:space="preserve">Junoh Lee</w:t>
+            </w:r>
+          </w:p>
+        </w:tc>
+        <w:tc>
+          <w:tcPr>
+            <w:tcW w:type="dxa" w:w="1684"/>
+            <w:tcBorders>
+              <w:top w:val="single" w:color="000000" w:sz="4"/>
+              <w:left w:val="single" w:color="000000" w:sz="4"/>
+              <w:bottom w:val="single" w:color="000000" w:sz="4"/>
+              <w:right w:val="single" w:color="000000" w:sz="4"/>
+            </w:tcBorders>
+            <w:tcMar>
+              <w:top w:type="dxa" w:w="80"/>
+              <w:left w:type="dxa" w:w="100"/>
+              <w:bottom w:type="dxa" w:w="80"/>
+              <w:right w:type="dxa" w:w="100"/>
+            </w:tcMar>
+            <w:vAlign w:val="center"/>
+          </w:tcPr>
+          <w:p>
+            <w:pPr>
+              <w:jc w:val="left"/>
+            </w:pPr>
+            <w:r>
+              <w:rPr>
+                <w:b w:val="false"/>
+                <w:bCs w:val="false"/>
+                <w:sz w:val="20"/>
+                <w:szCs w:val="20"/>
+              </w:rPr>
+              <w:t xml:space="preserve">2026-09-11</w:t>
+            </w:r>
+          </w:p>
+        </w:tc>
+        <w:tc>
+          <w:tcPr>
+            <w:tcW w:type="dxa" w:w="3931"/>
+            <w:tcBorders>
+              <w:top w:val="single" w:color="000000" w:sz="4"/>
+              <w:left w:val="single" w:color="000000" w:sz="4"/>
+              <w:bottom w:val="single" w:color="000000" w:sz="4"/>
+              <w:right w:val="single" w:color="000000" w:sz="4"/>
+            </w:tcBorders>
+            <w:tcMar>
+              <w:top w:type="dxa" w:w="80"/>
+              <w:left w:type="dxa" w:w="100"/>
+              <w:bottom w:type="dxa" w:w="80"/>
+              <w:right w:type="dxa" w:w="100"/>
+            </w:tcMar>
+            <w:vAlign w:val="center"/>
+          </w:tcPr>
+          <w:p>
+            <w:pPr>
+              <w:jc w:val="left"/>
+            </w:pPr>
+            <w:r>
+              <w:rPr>
+                <w:b w:val="false"/>
+                <w:bCs w:val="false"/>
+                <w:sz w:val="20"/>
+                <w:szCs w:val="20"/>
+              </w:rPr>
+              <w:t xml:space="preserve">Refined wording (watertight geometry healing; explicit CAE-accuracy priority in feature classification), cross-checked against teammate's independent FR draft</w:t>
+            </w:r>
+          </w:p>
+        </w:tc>
+        <w:tc>
+          <w:tcPr>
+            <w:tcW w:type="dxa" w:w="1684"/>
+            <w:tcBorders>
+              <w:top w:val="single" w:color="000000" w:sz="4"/>
+              <w:left w:val="single" w:color="000000" w:sz="4"/>
+              <w:bottom w:val="single" w:color="000000" w:sz="4"/>
+              <w:right w:val="single" w:color="000000" w:sz="4"/>
+            </w:tcBorders>
+            <w:tcMar>
+              <w:top w:type="dxa" w:w="80"/>
+              <w:left w:type="dxa" w:w="100"/>
+              <w:bottom w:type="dxa" w:w="80"/>
+              <w:right w:type="dxa" w:w="100"/>
+            </w:tcMar>
+            <w:vAlign w:val="center"/>
+          </w:tcPr>
+          <w:p>
+            <w:pPr>
+              <w:jc w:val="center"/>
+            </w:pPr>
+            <w:r>
+              <w:rPr>
+                <w:b w:val="false"/>
+                <w:bCs w:val="false"/>
+                <w:sz w:val="20"/>
+                <w:szCs w:val="20"/>
+              </w:rPr>
+              <w:t xml:space="preserve">1.2</w:t>
+            </w:r>
+          </w:p>
+        </w:tc>
+      </w:tr>
     </w:tbl>
     <w:p>
       <w:pPr>
@@ -1684,7 +1814,7 @@
                 <w:sz w:val="20"/>
                 <w:szCs w:val="20"/>
               </w:rPr>
-              <w:t xml:space="preserve">For each recognized feature, the system shall classify whether it is significant to CAE analysis accuracy or safe to remove.</w:t>
+              <w:t xml:space="preserve">For each recognized feature, the system shall classify whether it is safe to remove, prioritizing minimal impact on downstream CAE analysis accuracy.</w:t>
             </w:r>
           </w:p>
         </w:tc>
@@ -2373,7 +2503,7 @@
                 <w:sz w:val="20"/>
                 <w:szCs w:val="20"/>
               </w:rPr>
-              <w:t xml:space="preserve">After removing a feature, the system shall perform geometry healing to repair any resulting invalid or broken geometry.</w:t>
+              <w:t xml:space="preserve">After removing a feature, the system shall perform geometry healing to repair the resulting geometry into a valid, watertight model.</w:t>
             </w:r>
           </w:p>
         </w:tc>

</xml_diff>

<commit_message>
Pre-mentor-review pass: fix dual success-criterion ambiguity
FR-VAL-03/NFR-PERF-01 (70-90% time reduction) and FR-VAL-05/NFR-ACC-01
(defeaturing accuracy) both read as "the" success criterion. Clarify
that accuracy is primary and time reduction is a secondary efficiency
metric, so the mentor reviewing FRD/NFRD doesn't hit a contradiction.
</commit_message>
<xml_diff>
--- a/docs/Functional_Requirements_Document.docx
+++ b/docs/Functional_Requirements_Document.docx
@@ -751,6 +751,136 @@
           </w:p>
         </w:tc>
       </w:tr>
+      <w:tr>
+        <w:tc>
+          <w:tcPr>
+            <w:tcW w:type="dxa" w:w="2059"/>
+            <w:tcBorders>
+              <w:top w:val="single" w:color="000000" w:sz="4"/>
+              <w:left w:val="single" w:color="000000" w:sz="4"/>
+              <w:bottom w:val="single" w:color="000000" w:sz="4"/>
+              <w:right w:val="single" w:color="000000" w:sz="4"/>
+            </w:tcBorders>
+            <w:tcMar>
+              <w:top w:type="dxa" w:w="80"/>
+              <w:left w:type="dxa" w:w="100"/>
+              <w:bottom w:type="dxa" w:w="80"/>
+              <w:right w:type="dxa" w:w="100"/>
+            </w:tcMar>
+            <w:vAlign w:val="center"/>
+          </w:tcPr>
+          <w:p>
+            <w:pPr>
+              <w:jc w:val="left"/>
+            </w:pPr>
+            <w:r>
+              <w:rPr>
+                <w:b w:val="false"/>
+                <w:bCs w:val="false"/>
+                <w:sz w:val="20"/>
+                <w:szCs w:val="20"/>
+              </w:rPr>
+              <w:t xml:space="preserve">Junoh Lee</w:t>
+            </w:r>
+          </w:p>
+        </w:tc>
+        <w:tc>
+          <w:tcPr>
+            <w:tcW w:type="dxa" w:w="1684"/>
+            <w:tcBorders>
+              <w:top w:val="single" w:color="000000" w:sz="4"/>
+              <w:left w:val="single" w:color="000000" w:sz="4"/>
+              <w:bottom w:val="single" w:color="000000" w:sz="4"/>
+              <w:right w:val="single" w:color="000000" w:sz="4"/>
+            </w:tcBorders>
+            <w:tcMar>
+              <w:top w:type="dxa" w:w="80"/>
+              <w:left w:type="dxa" w:w="100"/>
+              <w:bottom w:type="dxa" w:w="80"/>
+              <w:right w:type="dxa" w:w="100"/>
+            </w:tcMar>
+            <w:vAlign w:val="center"/>
+          </w:tcPr>
+          <w:p>
+            <w:pPr>
+              <w:jc w:val="left"/>
+            </w:pPr>
+            <w:r>
+              <w:rPr>
+                <w:b w:val="false"/>
+                <w:bCs w:val="false"/>
+                <w:sz w:val="20"/>
+                <w:szCs w:val="20"/>
+              </w:rPr>
+              <w:t xml:space="preserve">2026-09-18</w:t>
+            </w:r>
+          </w:p>
+        </w:tc>
+        <w:tc>
+          <w:tcPr>
+            <w:tcW w:type="dxa" w:w="3931"/>
+            <w:tcBorders>
+              <w:top w:val="single" w:color="000000" w:sz="4"/>
+              <w:left w:val="single" w:color="000000" w:sz="4"/>
+              <w:bottom w:val="single" w:color="000000" w:sz="4"/>
+              <w:right w:val="single" w:color="000000" w:sz="4"/>
+            </w:tcBorders>
+            <w:tcMar>
+              <w:top w:type="dxa" w:w="80"/>
+              <w:left w:type="dxa" w:w="100"/>
+              <w:bottom w:type="dxa" w:w="80"/>
+              <w:right w:type="dxa" w:w="100"/>
+            </w:tcMar>
+            <w:vAlign w:val="center"/>
+          </w:tcPr>
+          <w:p>
+            <w:pPr>
+              <w:jc w:val="left"/>
+            </w:pPr>
+            <w:r>
+              <w:rPr>
+                <w:b w:val="false"/>
+                <w:bCs w:val="false"/>
+                <w:sz w:val="20"/>
+                <w:szCs w:val="20"/>
+              </w:rPr>
+              <w:t xml:space="preserve">Pre-mentor-review pass: clarified FR-VAL-03 (time reduction) as a secondary efficiency criterion vs. FR-VAL-05 (defeaturing accuracy) as the primary criterion, to remove an ambiguous double 'success criterion' claim</w:t>
+            </w:r>
+          </w:p>
+        </w:tc>
+        <w:tc>
+          <w:tcPr>
+            <w:tcW w:type="dxa" w:w="1684"/>
+            <w:tcBorders>
+              <w:top w:val="single" w:color="000000" w:sz="4"/>
+              <w:left w:val="single" w:color="000000" w:sz="4"/>
+              <w:bottom w:val="single" w:color="000000" w:sz="4"/>
+              <w:right w:val="single" w:color="000000" w:sz="4"/>
+            </w:tcBorders>
+            <w:tcMar>
+              <w:top w:type="dxa" w:w="80"/>
+              <w:left w:type="dxa" w:w="100"/>
+              <w:bottom w:type="dxa" w:w="80"/>
+              <w:right w:type="dxa" w:w="100"/>
+            </w:tcMar>
+            <w:vAlign w:val="center"/>
+          </w:tcPr>
+          <w:p>
+            <w:pPr>
+              <w:jc w:val="center"/>
+            </w:pPr>
+            <w:r>
+              <w:rPr>
+                <w:b w:val="false"/>
+                <w:bCs w:val="false"/>
+                <w:sz w:val="20"/>
+                <w:szCs w:val="20"/>
+              </w:rPr>
+              <w:t xml:space="preserve">1.4</w:t>
+            </w:r>
+          </w:p>
+        </w:tc>
+      </w:tr>
     </w:tbl>
     <w:p>
       <w:pPr>
@@ -3646,7 +3776,7 @@
                 <w:sz w:val="20"/>
                 <w:szCs w:val="20"/>
               </w:rPr>
-              <w:t xml:space="preserve">Success criterion: 70-90% preprocessing time reduction</w:t>
+              <w:t xml:space="preserve">Efficiency success criterion: 70-90% preprocessing time reduction. Secondary to defeaturing accuracy [see FR-VAL-05], the primary criterion</w:t>
             </w:r>
           </w:p>
         </w:tc>

</xml_diff>

<commit_message>
Record mentor-suggested face-highlight review as optional FR-VAL-06
HP mentor suggested marking faces selected for removal in red and
saving them as STEP for review. Recorded as a Want-priority option
(EN and KO FRD, v1.5); adoption is the team's call and feasibility
under headless FreeCAD is still unverified.
</commit_message>
<xml_diff>
--- a/docs/Functional_Requirements_Document.docx
+++ b/docs/Functional_Requirements_Document.docx
@@ -881,6 +881,136 @@
           </w:p>
         </w:tc>
       </w:tr>
+      <w:tr>
+        <w:tc>
+          <w:tcPr>
+            <w:tcW w:type="dxa" w:w="2059"/>
+            <w:tcBorders>
+              <w:top w:val="single" w:color="000000" w:sz="4"/>
+              <w:left w:val="single" w:color="000000" w:sz="4"/>
+              <w:bottom w:val="single" w:color="000000" w:sz="4"/>
+              <w:right w:val="single" w:color="000000" w:sz="4"/>
+            </w:tcBorders>
+            <w:tcMar>
+              <w:top w:type="dxa" w:w="80"/>
+              <w:left w:type="dxa" w:w="100"/>
+              <w:bottom w:type="dxa" w:w="80"/>
+              <w:right w:type="dxa" w:w="100"/>
+            </w:tcMar>
+            <w:vAlign w:val="center"/>
+          </w:tcPr>
+          <w:p>
+            <w:pPr>
+              <w:jc w:val="left"/>
+            </w:pPr>
+            <w:r>
+              <w:rPr>
+                <w:b w:val="false"/>
+                <w:bCs w:val="false"/>
+                <w:sz w:val="20"/>
+                <w:szCs w:val="20"/>
+              </w:rPr>
+              <w:t xml:space="preserve">Junoh Lee</w:t>
+            </w:r>
+          </w:p>
+        </w:tc>
+        <w:tc>
+          <w:tcPr>
+            <w:tcW w:type="dxa" w:w="1684"/>
+            <w:tcBorders>
+              <w:top w:val="single" w:color="000000" w:sz="4"/>
+              <w:left w:val="single" w:color="000000" w:sz="4"/>
+              <w:bottom w:val="single" w:color="000000" w:sz="4"/>
+              <w:right w:val="single" w:color="000000" w:sz="4"/>
+            </w:tcBorders>
+            <w:tcMar>
+              <w:top w:type="dxa" w:w="80"/>
+              <w:left w:type="dxa" w:w="100"/>
+              <w:bottom w:type="dxa" w:w="80"/>
+              <w:right w:type="dxa" w:w="100"/>
+            </w:tcMar>
+            <w:vAlign w:val="center"/>
+          </w:tcPr>
+          <w:p>
+            <w:pPr>
+              <w:jc w:val="left"/>
+            </w:pPr>
+            <w:r>
+              <w:rPr>
+                <w:b w:val="false"/>
+                <w:bCs w:val="false"/>
+                <w:sz w:val="20"/>
+                <w:szCs w:val="20"/>
+              </w:rPr>
+              <w:t xml:space="preserve">2026-09-21</w:t>
+            </w:r>
+          </w:p>
+        </w:tc>
+        <w:tc>
+          <w:tcPr>
+            <w:tcW w:type="dxa" w:w="3931"/>
+            <w:tcBorders>
+              <w:top w:val="single" w:color="000000" w:sz="4"/>
+              <w:left w:val="single" w:color="000000" w:sz="4"/>
+              <w:bottom w:val="single" w:color="000000" w:sz="4"/>
+              <w:right w:val="single" w:color="000000" w:sz="4"/>
+            </w:tcBorders>
+            <w:tcMar>
+              <w:top w:type="dxa" w:w="80"/>
+              <w:left w:type="dxa" w:w="100"/>
+              <w:bottom w:type="dxa" w:w="80"/>
+              <w:right w:type="dxa" w:w="100"/>
+            </w:tcMar>
+            <w:vAlign w:val="center"/>
+          </w:tcPr>
+          <w:p>
+            <w:pPr>
+              <w:jc w:val="left"/>
+            </w:pPr>
+            <w:r>
+              <w:rPr>
+                <w:b w:val="false"/>
+                <w:bCs w:val="false"/>
+                <w:sz w:val="20"/>
+                <w:szCs w:val="20"/>
+              </w:rPr>
+              <w:t xml:space="preserve">Recorded the mentor-suggested face-highlight review feature as an optional requirement (FR-VAL-06, Want)</w:t>
+            </w:r>
+          </w:p>
+        </w:tc>
+        <w:tc>
+          <w:tcPr>
+            <w:tcW w:type="dxa" w:w="1684"/>
+            <w:tcBorders>
+              <w:top w:val="single" w:color="000000" w:sz="4"/>
+              <w:left w:val="single" w:color="000000" w:sz="4"/>
+              <w:bottom w:val="single" w:color="000000" w:sz="4"/>
+              <w:right w:val="single" w:color="000000" w:sz="4"/>
+            </w:tcBorders>
+            <w:tcMar>
+              <w:top w:type="dxa" w:w="80"/>
+              <w:left w:type="dxa" w:w="100"/>
+              <w:bottom w:type="dxa" w:w="80"/>
+              <w:right w:type="dxa" w:w="100"/>
+            </w:tcMar>
+            <w:vAlign w:val="center"/>
+          </w:tcPr>
+          <w:p>
+            <w:pPr>
+              <w:jc w:val="center"/>
+            </w:pPr>
+            <w:r>
+              <w:rPr>
+                <w:b w:val="false"/>
+                <w:bCs w:val="false"/>
+                <w:sz w:val="20"/>
+                <w:szCs w:val="20"/>
+              </w:rPr>
+              <w:t xml:space="preserve">1.5</w:t>
+            </w:r>
+          </w:p>
+        </w:tc>
+      </w:tr>
     </w:tbl>
     <w:p>
       <w:pPr>
@@ -4037,6 +4167,136 @@
                 <w:szCs w:val="20"/>
               </w:rPr>
               <w:t xml:space="preserve">Confirmed with HP mentor 2026-09-18</w:t>
+            </w:r>
+          </w:p>
+        </w:tc>
+      </w:tr>
+      <w:tr>
+        <w:tc>
+          <w:tcPr>
+            <w:tcW w:type="dxa" w:w="2059"/>
+            <w:tcBorders>
+              <w:top w:val="single" w:color="000000" w:sz="4"/>
+              <w:left w:val="single" w:color="000000" w:sz="4"/>
+              <w:bottom w:val="single" w:color="000000" w:sz="4"/>
+              <w:right w:val="single" w:color="000000" w:sz="4"/>
+            </w:tcBorders>
+            <w:tcMar>
+              <w:top w:type="dxa" w:w="80"/>
+              <w:left w:type="dxa" w:w="100"/>
+              <w:bottom w:type="dxa" w:w="80"/>
+              <w:right w:type="dxa" w:w="100"/>
+            </w:tcMar>
+            <w:vAlign w:val="center"/>
+          </w:tcPr>
+          <w:p>
+            <w:pPr>
+              <w:jc w:val="left"/>
+            </w:pPr>
+            <w:r>
+              <w:rPr>
+                <w:b w:val="false"/>
+                <w:bCs w:val="false"/>
+                <w:sz w:val="20"/>
+                <w:szCs w:val="20"/>
+              </w:rPr>
+              <w:t xml:space="preserve">FR-VAL-06</w:t>
+            </w:r>
+          </w:p>
+        </w:tc>
+        <w:tc>
+          <w:tcPr>
+            <w:tcW w:type="dxa" w:w="4024"/>
+            <w:tcBorders>
+              <w:top w:val="single" w:color="000000" w:sz="4"/>
+              <w:left w:val="single" w:color="000000" w:sz="4"/>
+              <w:bottom w:val="single" w:color="000000" w:sz="4"/>
+              <w:right w:val="single" w:color="000000" w:sz="4"/>
+            </w:tcBorders>
+            <w:tcMar>
+              <w:top w:type="dxa" w:w="80"/>
+              <w:left w:type="dxa" w:w="100"/>
+              <w:bottom w:type="dxa" w:w="80"/>
+              <w:right w:type="dxa" w:w="100"/>
+            </w:tcMar>
+            <w:vAlign w:val="center"/>
+          </w:tcPr>
+          <w:p>
+            <w:pPr>
+              <w:jc w:val="left"/>
+            </w:pPr>
+            <w:r>
+              <w:rPr>
+                <w:b w:val="false"/>
+                <w:bCs w:val="false"/>
+                <w:sz w:val="20"/>
+                <w:szCs w:val="20"/>
+              </w:rPr>
+              <w:t xml:space="preserve">Before feature removal, the system shall be able to mark the faces selected for removal in red and save the marked model as a STEP file, processing multiple STEP files sequentially, so the engineer can review the face selection.</w:t>
+            </w:r>
+          </w:p>
+        </w:tc>
+        <w:tc>
+          <w:tcPr>
+            <w:tcW w:type="dxa" w:w="1404"/>
+            <w:tcBorders>
+              <w:top w:val="single" w:color="000000" w:sz="4"/>
+              <w:left w:val="single" w:color="000000" w:sz="4"/>
+              <w:bottom w:val="single" w:color="000000" w:sz="4"/>
+              <w:right w:val="single" w:color="000000" w:sz="4"/>
+            </w:tcBorders>
+            <w:tcMar>
+              <w:top w:type="dxa" w:w="80"/>
+              <w:left w:type="dxa" w:w="100"/>
+              <w:bottom w:type="dxa" w:w="80"/>
+              <w:right w:type="dxa" w:w="100"/>
+            </w:tcMar>
+            <w:vAlign w:val="center"/>
+          </w:tcPr>
+          <w:p>
+            <w:pPr>
+              <w:jc w:val="center"/>
+            </w:pPr>
+            <w:r>
+              <w:rPr>
+                <w:b w:val="false"/>
+                <w:bCs w:val="false"/>
+                <w:sz w:val="20"/>
+                <w:szCs w:val="20"/>
+              </w:rPr>
+              <w:t xml:space="preserve">Want</w:t>
+            </w:r>
+          </w:p>
+        </w:tc>
+        <w:tc>
+          <w:tcPr>
+            <w:tcW w:type="dxa" w:w="1872"/>
+            <w:tcBorders>
+              <w:top w:val="single" w:color="000000" w:sz="4"/>
+              <w:left w:val="single" w:color="000000" w:sz="4"/>
+              <w:bottom w:val="single" w:color="000000" w:sz="4"/>
+              <w:right w:val="single" w:color="000000" w:sz="4"/>
+            </w:tcBorders>
+            <w:tcMar>
+              <w:top w:type="dxa" w:w="80"/>
+              <w:left w:type="dxa" w:w="100"/>
+              <w:bottom w:type="dxa" w:w="80"/>
+              <w:right w:type="dxa" w:w="100"/>
+            </w:tcMar>
+            <w:vAlign w:val="center"/>
+          </w:tcPr>
+          <w:p>
+            <w:pPr>
+              <w:jc w:val="left"/>
+            </w:pPr>
+            <w:r>
+              <w:rPr>
+                <w:b w:val="false"/>
+                <w:bCs w:val="false"/>
+                <w:sz w:val="20"/>
+                <w:szCs w:val="20"/>
+              </w:rPr>
+              <w:t xml:space="preserve">Suggested by HP mentor by email (2026-09-21). Recorded as an optional requirement; the team decides whether to adopt it. Feasibility unverified: headless FreeCAD cannot store per-face color (no ViewObject), so an OCCT color-export path may be needed - to be confirmed by prototype</w:t>
             </w:r>
           </w:p>
         </w:tc>

</xml_diff>

<commit_message>
Upgrade FR-VAL-06 (face-highlight review file) from Want to Must
Mentor requirement, promoted to Must by team decision. FRD EN/KO v1.6.
</commit_message>
<xml_diff>
--- a/docs/Functional_Requirements_Document.docx
+++ b/docs/Functional_Requirements_Document.docx
@@ -1011,6 +1011,136 @@
           </w:p>
         </w:tc>
       </w:tr>
+      <w:tr>
+        <w:tc>
+          <w:tcPr>
+            <w:tcW w:type="dxa" w:w="2059"/>
+            <w:tcBorders>
+              <w:top w:val="single" w:color="000000" w:sz="4"/>
+              <w:left w:val="single" w:color="000000" w:sz="4"/>
+              <w:bottom w:val="single" w:color="000000" w:sz="4"/>
+              <w:right w:val="single" w:color="000000" w:sz="4"/>
+            </w:tcBorders>
+            <w:tcMar>
+              <w:top w:type="dxa" w:w="80"/>
+              <w:left w:type="dxa" w:w="100"/>
+              <w:bottom w:type="dxa" w:w="80"/>
+              <w:right w:type="dxa" w:w="100"/>
+            </w:tcMar>
+            <w:vAlign w:val="center"/>
+          </w:tcPr>
+          <w:p>
+            <w:pPr>
+              <w:jc w:val="left"/>
+            </w:pPr>
+            <w:r>
+              <w:rPr>
+                <w:b w:val="false"/>
+                <w:bCs w:val="false"/>
+                <w:sz w:val="20"/>
+                <w:szCs w:val="20"/>
+              </w:rPr>
+              <w:t xml:space="preserve">Junoh Lee</w:t>
+            </w:r>
+          </w:p>
+        </w:tc>
+        <w:tc>
+          <w:tcPr>
+            <w:tcW w:type="dxa" w:w="1684"/>
+            <w:tcBorders>
+              <w:top w:val="single" w:color="000000" w:sz="4"/>
+              <w:left w:val="single" w:color="000000" w:sz="4"/>
+              <w:bottom w:val="single" w:color="000000" w:sz="4"/>
+              <w:right w:val="single" w:color="000000" w:sz="4"/>
+            </w:tcBorders>
+            <w:tcMar>
+              <w:top w:type="dxa" w:w="80"/>
+              <w:left w:type="dxa" w:w="100"/>
+              <w:bottom w:type="dxa" w:w="80"/>
+              <w:right w:type="dxa" w:w="100"/>
+            </w:tcMar>
+            <w:vAlign w:val="center"/>
+          </w:tcPr>
+          <w:p>
+            <w:pPr>
+              <w:jc w:val="left"/>
+            </w:pPr>
+            <w:r>
+              <w:rPr>
+                <w:b w:val="false"/>
+                <w:bCs w:val="false"/>
+                <w:sz w:val="20"/>
+                <w:szCs w:val="20"/>
+              </w:rPr>
+              <w:t xml:space="preserve">2026-09-21</w:t>
+            </w:r>
+          </w:p>
+        </w:tc>
+        <w:tc>
+          <w:tcPr>
+            <w:tcW w:type="dxa" w:w="3931"/>
+            <w:tcBorders>
+              <w:top w:val="single" w:color="000000" w:sz="4"/>
+              <w:left w:val="single" w:color="000000" w:sz="4"/>
+              <w:bottom w:val="single" w:color="000000" w:sz="4"/>
+              <w:right w:val="single" w:color="000000" w:sz="4"/>
+            </w:tcBorders>
+            <w:tcMar>
+              <w:top w:type="dxa" w:w="80"/>
+              <w:left w:type="dxa" w:w="100"/>
+              <w:bottom w:type="dxa" w:w="80"/>
+              <w:right w:type="dxa" w:w="100"/>
+            </w:tcMar>
+            <w:vAlign w:val="center"/>
+          </w:tcPr>
+          <w:p>
+            <w:pPr>
+              <w:jc w:val="left"/>
+            </w:pPr>
+            <w:r>
+              <w:rPr>
+                <w:b w:val="false"/>
+                <w:bCs w:val="false"/>
+                <w:sz w:val="20"/>
+                <w:szCs w:val="20"/>
+              </w:rPr>
+              <w:t xml:space="preserve">Upgraded FR-VAL-06 (face-highlight review file) from Want to Must: mentor requirement</w:t>
+            </w:r>
+          </w:p>
+        </w:tc>
+        <w:tc>
+          <w:tcPr>
+            <w:tcW w:type="dxa" w:w="1684"/>
+            <w:tcBorders>
+              <w:top w:val="single" w:color="000000" w:sz="4"/>
+              <w:left w:val="single" w:color="000000" w:sz="4"/>
+              <w:bottom w:val="single" w:color="000000" w:sz="4"/>
+              <w:right w:val="single" w:color="000000" w:sz="4"/>
+            </w:tcBorders>
+            <w:tcMar>
+              <w:top w:type="dxa" w:w="80"/>
+              <w:left w:type="dxa" w:w="100"/>
+              <w:bottom w:type="dxa" w:w="80"/>
+              <w:right w:type="dxa" w:w="100"/>
+            </w:tcMar>
+            <w:vAlign w:val="center"/>
+          </w:tcPr>
+          <w:p>
+            <w:pPr>
+              <w:jc w:val="center"/>
+            </w:pPr>
+            <w:r>
+              <w:rPr>
+                <w:b w:val="false"/>
+                <w:bCs w:val="false"/>
+                <w:sz w:val="20"/>
+                <w:szCs w:val="20"/>
+              </w:rPr>
+              <w:t xml:space="preserve">1.6</w:t>
+            </w:r>
+          </w:p>
+        </w:tc>
+      </w:tr>
     </w:tbl>
     <w:p>
       <w:pPr>
@@ -4232,7 +4362,7 @@
                 <w:sz w:val="20"/>
                 <w:szCs w:val="20"/>
               </w:rPr>
-              <w:t xml:space="preserve">Before feature removal, the system shall be able to mark the faces selected for removal in red and save the marked model as a STEP file, processing multiple STEP files sequentially, so the engineer can review the face selection.</w:t>
+              <w:t xml:space="preserve">Before feature removal, the system shall mark the faces selected for removal in red and save the marked model as a STEP file, processing multiple STEP files sequentially, so the engineer can review the face selection.</w:t>
             </w:r>
           </w:p>
         </w:tc>
@@ -4264,7 +4394,7 @@
                 <w:sz w:val="20"/>
                 <w:szCs w:val="20"/>
               </w:rPr>
-              <w:t xml:space="preserve">Want</w:t>
+              <w:t xml:space="preserve">Must</w:t>
             </w:r>
           </w:p>
         </w:tc>
@@ -4296,7 +4426,7 @@
                 <w:sz w:val="20"/>
                 <w:szCs w:val="20"/>
               </w:rPr>
-              <w:t xml:space="preserve">Suggested by HP mentor by email (2026-09-21). Recorded as an optional requirement; the team decides whether to adopt it. Feasibility unverified: headless FreeCAD cannot store per-face color (no ViewObject), so an OCCT color-export path may be needed - to be confirmed by prototype</w:t>
+              <w:t xml:space="preserve">Requested by the HP mentor by email (2026-09-21); upgraded to Must by team decision. Feasibility unverified: headless FreeCAD cannot store per-face color (no ViewObject), so an OCCT color-export path may be needed - to be confirmed by prototype</w:t>
             </w:r>
           </w:p>
         </w:tc>

</xml_diff>

<commit_message>
Improve proposal readability + refresh FRD/NFRD/HLD with prototype status
- Project_Proposal.pptx: shorten on-slide bullets/tables, move full
  narrative to speaker notes, add a Proof-of-Concept slide with real
  FreeCAD screenshots, redesign Schedule/Risk/Team-Org slides as
  timeline/cards instead of dense tables
- FRD (v1.7), NFRD (v1.6), HLD (v1.3): verification-pass revision rows
  + short notes on requirements/modules confirming prototype coverage
  (src/cleancad_core.py, 9/9 example shapes) — no requirement content
  changed
- team_rnr.md, RnR_Proposal.docx, project_proposal_draft.md: correct
  remaining stale toolchain wording (pythonocc-core/occwl -> confirmed
  FreeCAD API) left over from the earlier toolchain-confirmation pass
</commit_message>
<xml_diff>
--- a/docs/Functional_Requirements_Document.docx
+++ b/docs/Functional_Requirements_Document.docx
@@ -1579,7 +1579,7 @@
                 <w:sz w:val="20"/>
                 <w:szCs w:val="20"/>
               </w:rPr>
-              <w:t xml:space="preserve">Toolchain confirmed by HP mentor 2026-09-18 (cadquery optional, STEP-generation only)</w:t>
+              <w:t xml:space="preserve">Toolchain confirmed by HP mentor 2026-09-18 (cadquery optional, STEP-generation only) Prototyped in src/cleancad_core.py.</w:t>
             </w:r>
           </w:p>
         </w:tc>
@@ -3217,7 +3217,7 @@
                 <w:sz w:val="20"/>
                 <w:szCs w:val="20"/>
               </w:rPr>
-              <w:t xml:space="preserve">Per HP mentor's proposed process: detect -&gt; remove face -&gt; geometry-healing</w:t>
+              <w:t xml:space="preserve">Per HP mentor's proposed process: detect -&gt; remove face -&gt; geometry-healing Prototyped and verified (9/9 example shapes) in src/cleancad_core.py.</w:t>
             </w:r>
           </w:p>
         </w:tc>
@@ -3477,7 +3477,7 @@
                 <w:sz w:val="20"/>
                 <w:szCs w:val="20"/>
               </w:rPr>
-              <w:t xml:space="preserve">Confirmed with HP mentor 2026-09-18: corrected cases feed back into Stage 2 retraining (FR-FEAT-06)</w:t>
+              <w:t xml:space="preserve">Confirmed with HP mentor 2026-09-18: corrected cases feed back into Stage 2 retraining (FR-FEAT-06) Silent-failure detection + storage prototyped in src/cleancad_core.py's remove_group()/process().</w:t>
             </w:r>
           </w:p>
         </w:tc>
@@ -4427,6 +4427,136 @@
                 <w:szCs w:val="20"/>
               </w:rPr>
               <w:t xml:space="preserve">Requested by the HP mentor by email (2026-09-21); upgraded to Must by team decision. Feasibility unverified: headless FreeCAD cannot store per-face color (no ViewObject), so an OCCT color-export path may be needed - to be confirmed by prototype</w:t>
+            </w:r>
+          </w:p>
+        </w:tc>
+      </w:tr>
+      <w:tr>
+        <w:tc>
+          <w:tcPr>
+            <w:tcW w:type="dxa" w:w="2059"/>
+            <w:tcBorders>
+              <w:top w:val="single" w:color="000000" w:sz="4"/>
+              <w:left w:val="single" w:color="000000" w:sz="4"/>
+              <w:bottom w:val="single" w:color="000000" w:sz="4"/>
+              <w:right w:val="single" w:color="000000" w:sz="4"/>
+            </w:tcBorders>
+            <w:tcMar>
+              <w:top w:type="dxa" w:w="80"/>
+              <w:left w:type="dxa" w:w="100"/>
+              <w:bottom w:type="dxa" w:w="80"/>
+              <w:right w:type="dxa" w:w="100"/>
+            </w:tcMar>
+            <w:vAlign w:val="center"/>
+          </w:tcPr>
+          <w:p>
+            <w:pPr>
+              <w:jc w:val="left"/>
+            </w:pPr>
+            <w:r>
+              <w:rPr>
+                <w:b w:val="false"/>
+                <w:bCs w:val="false"/>
+                <w:sz w:val="20"/>
+                <w:szCs w:val="20"/>
+              </w:rPr>
+              <w:t xml:space="preserve">Junoh Lee</w:t>
+            </w:r>
+          </w:p>
+        </w:tc>
+        <w:tc>
+          <w:tcPr>
+            <w:tcW w:type="dxa" w:w="4024"/>
+            <w:tcBorders>
+              <w:top w:val="single" w:color="000000" w:sz="4"/>
+              <w:left w:val="single" w:color="000000" w:sz="4"/>
+              <w:bottom w:val="single" w:color="000000" w:sz="4"/>
+              <w:right w:val="single" w:color="000000" w:sz="4"/>
+            </w:tcBorders>
+            <w:tcMar>
+              <w:top w:type="dxa" w:w="80"/>
+              <w:left w:type="dxa" w:w="100"/>
+              <w:bottom w:type="dxa" w:w="80"/>
+              <w:right w:type="dxa" w:w="100"/>
+            </w:tcMar>
+            <w:vAlign w:val="center"/>
+          </w:tcPr>
+          <w:p>
+            <w:pPr>
+              <w:jc w:val="left"/>
+            </w:pPr>
+            <w:r>
+              <w:rPr>
+                <w:b w:val="false"/>
+                <w:bCs w:val="false"/>
+                <w:sz w:val="20"/>
+                <w:szCs w:val="20"/>
+              </w:rPr>
+              <w:t xml:space="preserve">2026-09-29</w:t>
+            </w:r>
+          </w:p>
+        </w:tc>
+        <w:tc>
+          <w:tcPr>
+            <w:tcW w:type="dxa" w:w="1404"/>
+            <w:tcBorders>
+              <w:top w:val="single" w:color="000000" w:sz="4"/>
+              <w:left w:val="single" w:color="000000" w:sz="4"/>
+              <w:bottom w:val="single" w:color="000000" w:sz="4"/>
+              <w:right w:val="single" w:color="000000" w:sz="4"/>
+            </w:tcBorders>
+            <w:tcMar>
+              <w:top w:type="dxa" w:w="80"/>
+              <w:left w:type="dxa" w:w="100"/>
+              <w:bottom w:type="dxa" w:w="80"/>
+              <w:right w:type="dxa" w:w="100"/>
+            </w:tcMar>
+            <w:vAlign w:val="center"/>
+          </w:tcPr>
+          <w:p>
+            <w:pPr>
+              <w:jc w:val="center"/>
+            </w:pPr>
+            <w:r>
+              <w:rPr>
+                <w:b w:val="false"/>
+                <w:bCs w:val="false"/>
+                <w:sz w:val="20"/>
+                <w:szCs w:val="20"/>
+              </w:rPr>
+              <w:t xml:space="preserve">Full-document verification pass: cross-checked against the working src/cleancad_core.py prototype (9/9 self-authored example shapes pass headless verification); added prototype references to FR-IO-02, FR-DEF-01/02/04. No requirement content changed.</w:t>
+            </w:r>
+          </w:p>
+        </w:tc>
+        <w:tc>
+          <w:tcPr>
+            <w:tcW w:type="dxa" w:w="1872"/>
+            <w:tcBorders>
+              <w:top w:val="single" w:color="000000" w:sz="4"/>
+              <w:left w:val="single" w:color="000000" w:sz="4"/>
+              <w:bottom w:val="single" w:color="000000" w:sz="4"/>
+              <w:right w:val="single" w:color="000000" w:sz="4"/>
+            </w:tcBorders>
+            <w:tcMar>
+              <w:top w:type="dxa" w:w="80"/>
+              <w:left w:type="dxa" w:w="100"/>
+              <w:bottom w:type="dxa" w:w="80"/>
+              <w:right w:type="dxa" w:w="100"/>
+            </w:tcMar>
+            <w:vAlign w:val="center"/>
+          </w:tcPr>
+          <w:p>
+            <w:pPr>
+              <w:jc w:val="left"/>
+            </w:pPr>
+            <w:r>
+              <w:rPr>
+                <w:b w:val="false"/>
+                <w:bCs w:val="false"/>
+                <w:sz w:val="20"/>
+                <w:szCs w:val="20"/>
+              </w:rPr>
+              <w:t xml:space="preserve">1.7</w:t>
             </w:r>
           </w:p>
         </w:tc>

</xml_diff>

<commit_message>
Record HP mentor proposal feedback as Want candidates (FRD v1.8, NFRD v1.7, HLD v1.4)
Adds FR-FEAT-07/08/09, FR-DEF-05, FR-VAL-07, FR-DATA-04, NFR-ACC-03 as
unverified Want items and notes them in HLD/architecture open points.
Also moves the v1.7/v1.6 verification rows from the requirement tables
into the Revised History tables, where they belong.
</commit_message>
<xml_diff>
--- a/docs/Functional_Requirements_Document.docx
+++ b/docs/Functional_Requirements_Document.docx
@@ -1141,6 +1141,266 @@
           </w:p>
         </w:tc>
       </w:tr>
+      <w:tr>
+        <w:tc>
+          <w:tcPr>
+            <w:tcW w:type="dxa" w:w="2059"/>
+            <w:tcBorders>
+              <w:top w:val="single" w:color="000000" w:sz="4"/>
+              <w:left w:val="single" w:color="000000" w:sz="4"/>
+              <w:bottom w:val="single" w:color="000000" w:sz="4"/>
+              <w:right w:val="single" w:color="000000" w:sz="4"/>
+            </w:tcBorders>
+            <w:tcMar>
+              <w:top w:type="dxa" w:w="80"/>
+              <w:left w:type="dxa" w:w="100"/>
+              <w:bottom w:type="dxa" w:w="80"/>
+              <w:right w:type="dxa" w:w="100"/>
+            </w:tcMar>
+            <w:vAlign w:val="center"/>
+          </w:tcPr>
+          <w:p>
+            <w:pPr>
+              <w:jc w:val="left"/>
+            </w:pPr>
+            <w:r>
+              <w:rPr>
+                <w:b w:val="false"/>
+                <w:bCs w:val="false"/>
+                <w:sz w:val="20"/>
+                <w:szCs w:val="20"/>
+              </w:rPr>
+              <w:t xml:space="preserve">Junoh Lee</w:t>
+            </w:r>
+          </w:p>
+        </w:tc>
+        <w:tc>
+          <w:tcPr>
+            <w:tcW w:type="dxa" w:w="4024"/>
+            <w:tcBorders>
+              <w:top w:val="single" w:color="000000" w:sz="4"/>
+              <w:left w:val="single" w:color="000000" w:sz="4"/>
+              <w:bottom w:val="single" w:color="000000" w:sz="4"/>
+              <w:right w:val="single" w:color="000000" w:sz="4"/>
+            </w:tcBorders>
+            <w:tcMar>
+              <w:top w:type="dxa" w:w="80"/>
+              <w:left w:type="dxa" w:w="100"/>
+              <w:bottom w:type="dxa" w:w="80"/>
+              <w:right w:type="dxa" w:w="100"/>
+            </w:tcMar>
+            <w:vAlign w:val="center"/>
+          </w:tcPr>
+          <w:p>
+            <w:pPr>
+              <w:jc w:val="left"/>
+            </w:pPr>
+            <w:r>
+              <w:rPr>
+                <w:b w:val="false"/>
+                <w:bCs w:val="false"/>
+                <w:sz w:val="20"/>
+                <w:szCs w:val="20"/>
+              </w:rPr>
+              <w:t xml:space="preserve">2026-09-29</w:t>
+            </w:r>
+          </w:p>
+        </w:tc>
+        <w:tc>
+          <w:tcPr>
+            <w:tcW w:type="dxa" w:w="1404"/>
+            <w:tcBorders>
+              <w:top w:val="single" w:color="000000" w:sz="4"/>
+              <w:left w:val="single" w:color="000000" w:sz="4"/>
+              <w:bottom w:val="single" w:color="000000" w:sz="4"/>
+              <w:right w:val="single" w:color="000000" w:sz="4"/>
+            </w:tcBorders>
+            <w:tcMar>
+              <w:top w:type="dxa" w:w="80"/>
+              <w:left w:type="dxa" w:w="100"/>
+              <w:bottom w:type="dxa" w:w="80"/>
+              <w:right w:type="dxa" w:w="100"/>
+            </w:tcMar>
+            <w:vAlign w:val="center"/>
+          </w:tcPr>
+          <w:p>
+            <w:pPr>
+              <w:jc w:val="center"/>
+            </w:pPr>
+            <w:r>
+              <w:rPr>
+                <w:b w:val="false"/>
+                <w:bCs w:val="false"/>
+                <w:sz w:val="20"/>
+                <w:szCs w:val="20"/>
+              </w:rPr>
+              <w:t xml:space="preserve">Full-document verification pass: cross-checked against the working src/cleancad_core.py prototype (9/9 self-authored example shapes pass headless verification); added prototype references to FR-IO-02, FR-DEF-01/02/04. No requirement content changed.</w:t>
+            </w:r>
+          </w:p>
+        </w:tc>
+        <w:tc>
+          <w:tcPr>
+            <w:tcW w:type="dxa" w:w="1872"/>
+            <w:tcBorders>
+              <w:top w:val="single" w:color="000000" w:sz="4"/>
+              <w:left w:val="single" w:color="000000" w:sz="4"/>
+              <w:bottom w:val="single" w:color="000000" w:sz="4"/>
+              <w:right w:val="single" w:color="000000" w:sz="4"/>
+            </w:tcBorders>
+            <w:tcMar>
+              <w:top w:type="dxa" w:w="80"/>
+              <w:left w:type="dxa" w:w="100"/>
+              <w:bottom w:type="dxa" w:w="80"/>
+              <w:right w:type="dxa" w:w="100"/>
+            </w:tcMar>
+            <w:vAlign w:val="center"/>
+          </w:tcPr>
+          <w:p>
+            <w:pPr>
+              <w:jc w:val="left"/>
+            </w:pPr>
+            <w:r>
+              <w:rPr>
+                <w:b w:val="false"/>
+                <w:bCs w:val="false"/>
+                <w:sz w:val="20"/>
+                <w:szCs w:val="20"/>
+              </w:rPr>
+              <w:t xml:space="preserve">1.7</w:t>
+            </w:r>
+          </w:p>
+        </w:tc>
+      </w:tr>
+      <w:tr>
+        <w:tc>
+          <w:tcPr>
+            <w:tcW w:type="dxa" w:w="2059"/>
+            <w:tcBorders>
+              <w:top w:val="single" w:color="000000" w:sz="4"/>
+              <w:left w:val="single" w:color="000000" w:sz="4"/>
+              <w:bottom w:val="single" w:color="000000" w:sz="4"/>
+              <w:right w:val="single" w:color="000000" w:sz="4"/>
+            </w:tcBorders>
+            <w:tcMar>
+              <w:top w:type="dxa" w:w="80"/>
+              <w:left w:type="dxa" w:w="100"/>
+              <w:bottom w:type="dxa" w:w="80"/>
+              <w:right w:type="dxa" w:w="100"/>
+            </w:tcMar>
+            <w:vAlign w:val="center"/>
+          </w:tcPr>
+          <w:p>
+            <w:pPr>
+              <w:jc w:val="left"/>
+            </w:pPr>
+            <w:r>
+              <w:rPr>
+                <w:b w:val="false"/>
+                <w:bCs w:val="false"/>
+                <w:sz w:val="20"/>
+                <w:szCs w:val="20"/>
+              </w:rPr>
+              <w:t xml:space="preserve">Junoh Lee</w:t>
+            </w:r>
+          </w:p>
+        </w:tc>
+        <w:tc>
+          <w:tcPr>
+            <w:tcW w:type="dxa" w:w="4024"/>
+            <w:tcBorders>
+              <w:top w:val="single" w:color="000000" w:sz="4"/>
+              <w:left w:val="single" w:color="000000" w:sz="4"/>
+              <w:bottom w:val="single" w:color="000000" w:sz="4"/>
+              <w:right w:val="single" w:color="000000" w:sz="4"/>
+            </w:tcBorders>
+            <w:tcMar>
+              <w:top w:type="dxa" w:w="80"/>
+              <w:left w:type="dxa" w:w="100"/>
+              <w:bottom w:type="dxa" w:w="80"/>
+              <w:right w:type="dxa" w:w="100"/>
+            </w:tcMar>
+            <w:vAlign w:val="center"/>
+          </w:tcPr>
+          <w:p>
+            <w:pPr>
+              <w:jc w:val="left"/>
+            </w:pPr>
+            <w:r>
+              <w:rPr>
+                <w:b w:val="false"/>
+                <w:bCs w:val="false"/>
+                <w:sz w:val="20"/>
+                <w:szCs w:val="20"/>
+              </w:rPr>
+              <w:t xml:space="preserve">2026-10-02</w:t>
+            </w:r>
+          </w:p>
+        </w:tc>
+        <w:tc>
+          <w:tcPr>
+            <w:tcW w:type="dxa" w:w="1404"/>
+            <w:tcBorders>
+              <w:top w:val="single" w:color="000000" w:sz="4"/>
+              <w:left w:val="single" w:color="000000" w:sz="4"/>
+              <w:bottom w:val="single" w:color="000000" w:sz="4"/>
+              <w:right w:val="single" w:color="000000" w:sz="4"/>
+            </w:tcBorders>
+            <w:tcMar>
+              <w:top w:type="dxa" w:w="80"/>
+              <w:left w:type="dxa" w:w="100"/>
+              <w:bottom w:type="dxa" w:w="80"/>
+              <w:right w:type="dxa" w:w="100"/>
+            </w:tcMar>
+            <w:vAlign w:val="center"/>
+          </w:tcPr>
+          <w:p>
+            <w:pPr>
+              <w:jc w:val="center"/>
+            </w:pPr>
+            <w:r>
+              <w:rPr>
+                <w:b w:val="false"/>
+                <w:bCs w:val="false"/>
+                <w:sz w:val="20"/>
+                <w:szCs w:val="20"/>
+              </w:rPr>
+              <w:t xml:space="preserve">Recorded HP mentor feedback on the proposal as Want candidates (unverified, team decision pending): explicit dimension thresholds for Stage 1 rules (FR-FEAT-07), logo feature category (FR-FEAT-08), supervisory layer for rule/ML conflicts (FR-FEAT-09), separate tracking of removal-execution failures (FR-DEF-05), selection vs. execution accuracy reporting (FR-VAL-07), expanded validation dataset (FR-DATA-04).</w:t>
+            </w:r>
+          </w:p>
+        </w:tc>
+        <w:tc>
+          <w:tcPr>
+            <w:tcW w:type="dxa" w:w="1872"/>
+            <w:tcBorders>
+              <w:top w:val="single" w:color="000000" w:sz="4"/>
+              <w:left w:val="single" w:color="000000" w:sz="4"/>
+              <w:bottom w:val="single" w:color="000000" w:sz="4"/>
+              <w:right w:val="single" w:color="000000" w:sz="4"/>
+            </w:tcBorders>
+            <w:tcMar>
+              <w:top w:type="dxa" w:w="80"/>
+              <w:left w:type="dxa" w:w="100"/>
+              <w:bottom w:type="dxa" w:w="80"/>
+              <w:right w:type="dxa" w:w="100"/>
+            </w:tcMar>
+            <w:vAlign w:val="center"/>
+          </w:tcPr>
+          <w:p>
+            <w:pPr>
+              <w:jc w:val="left"/>
+            </w:pPr>
+            <w:r>
+              <w:rPr>
+                <w:b w:val="false"/>
+                <w:bCs w:val="false"/>
+                <w:sz w:val="20"/>
+                <w:szCs w:val="20"/>
+              </w:rPr>
+              <w:t xml:space="preserve">1.8</w:t>
+            </w:r>
+          </w:p>
+        </w:tc>
+      </w:tr>
     </w:tbl>
     <w:p>
       <w:pPr>
@@ -2793,6 +3053,396 @@
           </w:p>
         </w:tc>
       </w:tr>
+      <w:tr>
+        <w:tc>
+          <w:tcPr>
+            <w:tcW w:type="dxa" w:w="2059"/>
+            <w:tcBorders>
+              <w:top w:val="single" w:color="000000" w:sz="4"/>
+              <w:left w:val="single" w:color="000000" w:sz="4"/>
+              <w:bottom w:val="single" w:color="000000" w:sz="4"/>
+              <w:right w:val="single" w:color="000000" w:sz="4"/>
+            </w:tcBorders>
+            <w:tcMar>
+              <w:top w:type="dxa" w:w="80"/>
+              <w:left w:type="dxa" w:w="100"/>
+              <w:bottom w:type="dxa" w:w="80"/>
+              <w:right w:type="dxa" w:w="100"/>
+            </w:tcMar>
+            <w:vAlign w:val="center"/>
+          </w:tcPr>
+          <w:p>
+            <w:pPr>
+              <w:jc w:val="left"/>
+            </w:pPr>
+            <w:r>
+              <w:rPr>
+                <w:b w:val="false"/>
+                <w:bCs w:val="false"/>
+                <w:sz w:val="20"/>
+                <w:szCs w:val="20"/>
+              </w:rPr>
+              <w:t xml:space="preserve">FR-FEAT-07</w:t>
+            </w:r>
+          </w:p>
+        </w:tc>
+        <w:tc>
+          <w:tcPr>
+            <w:tcW w:type="dxa" w:w="4024"/>
+            <w:tcBorders>
+              <w:top w:val="single" w:color="000000" w:sz="4"/>
+              <w:left w:val="single" w:color="000000" w:sz="4"/>
+              <w:bottom w:val="single" w:color="000000" w:sz="4"/>
+              <w:right w:val="single" w:color="000000" w:sz="4"/>
+            </w:tcBorders>
+            <w:tcMar>
+              <w:top w:type="dxa" w:w="80"/>
+              <w:left w:type="dxa" w:w="100"/>
+              <w:bottom w:type="dxa" w:w="80"/>
+              <w:right w:type="dxa" w:w="100"/>
+            </w:tcMar>
+            <w:vAlign w:val="center"/>
+          </w:tcPr>
+          <w:p>
+            <w:pPr>
+              <w:jc w:val="left"/>
+            </w:pPr>
+            <w:r>
+              <w:rPr>
+                <w:b w:val="false"/>
+                <w:bCs w:val="false"/>
+                <w:sz w:val="20"/>
+                <w:szCs w:val="20"/>
+              </w:rPr>
+              <w:t xml:space="preserve">Stage 1 rule-based decisions should use explicit, configurable dimension thresholds (e.g., hole diameter, chamfer size, fillet radius) so that decisions remain explainable.</w:t>
+            </w:r>
+          </w:p>
+        </w:tc>
+        <w:tc>
+          <w:tcPr>
+            <w:tcW w:type="dxa" w:w="1404"/>
+            <w:tcBorders>
+              <w:top w:val="single" w:color="000000" w:sz="4"/>
+              <w:left w:val="single" w:color="000000" w:sz="4"/>
+              <w:bottom w:val="single" w:color="000000" w:sz="4"/>
+              <w:right w:val="single" w:color="000000" w:sz="4"/>
+            </w:tcBorders>
+            <w:tcMar>
+              <w:top w:type="dxa" w:w="80"/>
+              <w:left w:type="dxa" w:w="100"/>
+              <w:bottom w:type="dxa" w:w="80"/>
+              <w:right w:type="dxa" w:w="100"/>
+            </w:tcMar>
+            <w:vAlign w:val="center"/>
+          </w:tcPr>
+          <w:p>
+            <w:pPr>
+              <w:jc w:val="center"/>
+            </w:pPr>
+            <w:r>
+              <w:rPr>
+                <w:b w:val="false"/>
+                <w:bCs w:val="false"/>
+                <w:sz w:val="20"/>
+                <w:szCs w:val="20"/>
+              </w:rPr>
+              <w:t xml:space="preserve">Want</w:t>
+            </w:r>
+          </w:p>
+        </w:tc>
+        <w:tc>
+          <w:tcPr>
+            <w:tcW w:type="dxa" w:w="1872"/>
+            <w:tcBorders>
+              <w:top w:val="single" w:color="000000" w:sz="4"/>
+              <w:left w:val="single" w:color="000000" w:sz="4"/>
+              <w:bottom w:val="single" w:color="000000" w:sz="4"/>
+              <w:right w:val="single" w:color="000000" w:sz="4"/>
+            </w:tcBorders>
+            <w:tcMar>
+              <w:top w:type="dxa" w:w="80"/>
+              <w:left w:type="dxa" w:w="100"/>
+              <w:bottom w:type="dxa" w:w="80"/>
+              <w:right w:type="dxa" w:w="100"/>
+            </w:tcMar>
+            <w:vAlign w:val="center"/>
+          </w:tcPr>
+          <w:p>
+            <w:pPr>
+              <w:jc w:val="left"/>
+            </w:pPr>
+            <w:r>
+              <w:rPr>
+                <w:b w:val="false"/>
+                <w:bCs w:val="false"/>
+                <w:sz w:val="20"/>
+                <w:szCs w:val="20"/>
+              </w:rPr>
+              <w:t xml:space="preserve">Suggested by HP mentor (reply to proposal, relayed 2026-10-02); unverified, team decision pending. Threshold values are to be defined by the team.</w:t>
+            </w:r>
+          </w:p>
+        </w:tc>
+      </w:tr>
+      <w:tr>
+        <w:tc>
+          <w:tcPr>
+            <w:tcW w:type="dxa" w:w="2059"/>
+            <w:tcBorders>
+              <w:top w:val="single" w:color="000000" w:sz="4"/>
+              <w:left w:val="single" w:color="000000" w:sz="4"/>
+              <w:bottom w:val="single" w:color="000000" w:sz="4"/>
+              <w:right w:val="single" w:color="000000" w:sz="4"/>
+            </w:tcBorders>
+            <w:tcMar>
+              <w:top w:type="dxa" w:w="80"/>
+              <w:left w:type="dxa" w:w="100"/>
+              <w:bottom w:type="dxa" w:w="80"/>
+              <w:right w:type="dxa" w:w="100"/>
+            </w:tcMar>
+            <w:vAlign w:val="center"/>
+          </w:tcPr>
+          <w:p>
+            <w:pPr>
+              <w:jc w:val="left"/>
+            </w:pPr>
+            <w:r>
+              <w:rPr>
+                <w:b w:val="false"/>
+                <w:bCs w:val="false"/>
+                <w:sz w:val="20"/>
+                <w:szCs w:val="20"/>
+              </w:rPr>
+              <w:t xml:space="preserve">FR-FEAT-08</w:t>
+            </w:r>
+          </w:p>
+        </w:tc>
+        <w:tc>
+          <w:tcPr>
+            <w:tcW w:type="dxa" w:w="4024"/>
+            <w:tcBorders>
+              <w:top w:val="single" w:color="000000" w:sz="4"/>
+              <w:left w:val="single" w:color="000000" w:sz="4"/>
+              <w:bottom w:val="single" w:color="000000" w:sz="4"/>
+              <w:right w:val="single" w:color="000000" w:sz="4"/>
+            </w:tcBorders>
+            <w:tcMar>
+              <w:top w:type="dxa" w:w="80"/>
+              <w:left w:type="dxa" w:w="100"/>
+              <w:bottom w:type="dxa" w:w="80"/>
+              <w:right w:type="dxa" w:w="100"/>
+            </w:tcMar>
+            <w:vAlign w:val="center"/>
+          </w:tcPr>
+          <w:p>
+            <w:pPr>
+              <w:jc w:val="left"/>
+            </w:pPr>
+            <w:r>
+              <w:rPr>
+                <w:b w:val="false"/>
+                <w:bCs w:val="false"/>
+                <w:sz w:val="20"/>
+                <w:szCs w:val="20"/>
+              </w:rPr>
+              <w:t xml:space="preserve">The system should support logos (characters, surface markings, embossed or engraved text) as an additional feature category for defeaturing.</w:t>
+            </w:r>
+          </w:p>
+        </w:tc>
+        <w:tc>
+          <w:tcPr>
+            <w:tcW w:type="dxa" w:w="1404"/>
+            <w:tcBorders>
+              <w:top w:val="single" w:color="000000" w:sz="4"/>
+              <w:left w:val="single" w:color="000000" w:sz="4"/>
+              <w:bottom w:val="single" w:color="000000" w:sz="4"/>
+              <w:right w:val="single" w:color="000000" w:sz="4"/>
+            </w:tcBorders>
+            <w:tcMar>
+              <w:top w:type="dxa" w:w="80"/>
+              <w:left w:type="dxa" w:w="100"/>
+              <w:bottom w:type="dxa" w:w="80"/>
+              <w:right w:type="dxa" w:w="100"/>
+            </w:tcMar>
+            <w:vAlign w:val="center"/>
+          </w:tcPr>
+          <w:p>
+            <w:pPr>
+              <w:jc w:val="center"/>
+            </w:pPr>
+            <w:r>
+              <w:rPr>
+                <w:b w:val="false"/>
+                <w:bCs w:val="false"/>
+                <w:sz w:val="20"/>
+                <w:szCs w:val="20"/>
+              </w:rPr>
+              <w:t xml:space="preserve">Want</w:t>
+            </w:r>
+          </w:p>
+        </w:tc>
+        <w:tc>
+          <w:tcPr>
+            <w:tcW w:type="dxa" w:w="1872"/>
+            <w:tcBorders>
+              <w:top w:val="single" w:color="000000" w:sz="4"/>
+              <w:left w:val="single" w:color="000000" w:sz="4"/>
+              <w:bottom w:val="single" w:color="000000" w:sz="4"/>
+              <w:right w:val="single" w:color="000000" w:sz="4"/>
+            </w:tcBorders>
+            <w:tcMar>
+              <w:top w:type="dxa" w:w="80"/>
+              <w:left w:type="dxa" w:w="100"/>
+              <w:bottom w:type="dxa" w:w="80"/>
+              <w:right w:type="dxa" w:w="100"/>
+            </w:tcMar>
+            <w:vAlign w:val="center"/>
+          </w:tcPr>
+          <w:p>
+            <w:pPr>
+              <w:jc w:val="left"/>
+            </w:pPr>
+            <w:r>
+              <w:rPr>
+                <w:b w:val="false"/>
+                <w:bCs w:val="false"/>
+                <w:sz w:val="20"/>
+                <w:szCs w:val="20"/>
+              </w:rPr>
+              <w:t xml:space="preserve">Suggested by HP mentor (reply to proposal, relayed 2026-10-02); unverified, team decision pending. Scope open: HP's initially named shape types remain the priority; relation to the existing emboss type to be clarified.</w:t>
+            </w:r>
+          </w:p>
+        </w:tc>
+      </w:tr>
+      <w:tr>
+        <w:tc>
+          <w:tcPr>
+            <w:tcW w:type="dxa" w:w="2059"/>
+            <w:tcBorders>
+              <w:top w:val="single" w:color="000000" w:sz="4"/>
+              <w:left w:val="single" w:color="000000" w:sz="4"/>
+              <w:bottom w:val="single" w:color="000000" w:sz="4"/>
+              <w:right w:val="single" w:color="000000" w:sz="4"/>
+            </w:tcBorders>
+            <w:tcMar>
+              <w:top w:type="dxa" w:w="80"/>
+              <w:left w:type="dxa" w:w="100"/>
+              <w:bottom w:type="dxa" w:w="80"/>
+              <w:right w:type="dxa" w:w="100"/>
+            </w:tcMar>
+            <w:vAlign w:val="center"/>
+          </w:tcPr>
+          <w:p>
+            <w:pPr>
+              <w:jc w:val="left"/>
+            </w:pPr>
+            <w:r>
+              <w:rPr>
+                <w:b w:val="false"/>
+                <w:bCs w:val="false"/>
+                <w:sz w:val="20"/>
+                <w:szCs w:val="20"/>
+              </w:rPr>
+              <w:t xml:space="preserve">FR-FEAT-09</w:t>
+            </w:r>
+          </w:p>
+        </w:tc>
+        <w:tc>
+          <w:tcPr>
+            <w:tcW w:type="dxa" w:w="4024"/>
+            <w:tcBorders>
+              <w:top w:val="single" w:color="000000" w:sz="4"/>
+              <w:left w:val="single" w:color="000000" w:sz="4"/>
+              <w:bottom w:val="single" w:color="000000" w:sz="4"/>
+              <w:right w:val="single" w:color="000000" w:sz="4"/>
+            </w:tcBorders>
+            <w:tcMar>
+              <w:top w:type="dxa" w:w="80"/>
+              <w:left w:type="dxa" w:w="100"/>
+              <w:bottom w:type="dxa" w:w="80"/>
+              <w:right w:type="dxa" w:w="100"/>
+            </w:tcMar>
+            <w:vAlign w:val="center"/>
+          </w:tcPr>
+          <w:p>
+            <w:pPr>
+              <w:jc w:val="left"/>
+            </w:pPr>
+            <w:r>
+              <w:rPr>
+                <w:b w:val="false"/>
+                <w:bCs w:val="false"/>
+                <w:sz w:val="20"/>
+                <w:szCs w:val="20"/>
+              </w:rPr>
+              <w:t xml:space="preserve">When the Stage 1 (rule-based) and Stage 2 (ML-based) recommendations for a feature conflict, a supervisory decision step should determine the final proposed action.</w:t>
+            </w:r>
+          </w:p>
+        </w:tc>
+        <w:tc>
+          <w:tcPr>
+            <w:tcW w:type="dxa" w:w="1404"/>
+            <w:tcBorders>
+              <w:top w:val="single" w:color="000000" w:sz="4"/>
+              <w:left w:val="single" w:color="000000" w:sz="4"/>
+              <w:bottom w:val="single" w:color="000000" w:sz="4"/>
+              <w:right w:val="single" w:color="000000" w:sz="4"/>
+            </w:tcBorders>
+            <w:tcMar>
+              <w:top w:type="dxa" w:w="80"/>
+              <w:left w:type="dxa" w:w="100"/>
+              <w:bottom w:type="dxa" w:w="80"/>
+              <w:right w:type="dxa" w:w="100"/>
+            </w:tcMar>
+            <w:vAlign w:val="center"/>
+          </w:tcPr>
+          <w:p>
+            <w:pPr>
+              <w:jc w:val="center"/>
+            </w:pPr>
+            <w:r>
+              <w:rPr>
+                <w:b w:val="false"/>
+                <w:bCs w:val="false"/>
+                <w:sz w:val="20"/>
+                <w:szCs w:val="20"/>
+              </w:rPr>
+              <w:t xml:space="preserve">Want</w:t>
+            </w:r>
+          </w:p>
+        </w:tc>
+        <w:tc>
+          <w:tcPr>
+            <w:tcW w:type="dxa" w:w="1872"/>
+            <w:tcBorders>
+              <w:top w:val="single" w:color="000000" w:sz="4"/>
+              <w:left w:val="single" w:color="000000" w:sz="4"/>
+              <w:bottom w:val="single" w:color="000000" w:sz="4"/>
+              <w:right w:val="single" w:color="000000" w:sz="4"/>
+            </w:tcBorders>
+            <w:tcMar>
+              <w:top w:type="dxa" w:w="80"/>
+              <w:left w:type="dxa" w:w="100"/>
+              <w:bottom w:type="dxa" w:w="80"/>
+              <w:right w:type="dxa" w:w="100"/>
+            </w:tcMar>
+            <w:vAlign w:val="center"/>
+          </w:tcPr>
+          <w:p>
+            <w:pPr>
+              <w:jc w:val="left"/>
+            </w:pPr>
+            <w:r>
+              <w:rPr>
+                <w:b w:val="false"/>
+                <w:bCs w:val="false"/>
+                <w:sz w:val="20"/>
+                <w:szCs w:val="20"/>
+              </w:rPr>
+              <w:t xml:space="preserve">Suggested by HP mentor (reply to proposal, relayed 2026-10-02); unverified, team decision pending. Design open (affects M4).</w:t>
+            </w:r>
+          </w:p>
+        </w:tc>
+      </w:tr>
     </w:tbl>
     <w:p>
       <w:pPr>
@@ -3478,6 +4128,136 @@
                 <w:szCs w:val="20"/>
               </w:rPr>
               <w:t xml:space="preserve">Confirmed with HP mentor 2026-09-18: corrected cases feed back into Stage 2 retraining (FR-FEAT-06) Silent-failure detection + storage prototyped in src/cleancad_core.py's remove_group()/process().</w:t>
+            </w:r>
+          </w:p>
+        </w:tc>
+      </w:tr>
+      <w:tr>
+        <w:tc>
+          <w:tcPr>
+            <w:tcW w:type="dxa" w:w="2059"/>
+            <w:tcBorders>
+              <w:top w:val="single" w:color="000000" w:sz="4"/>
+              <w:left w:val="single" w:color="000000" w:sz="4"/>
+              <w:bottom w:val="single" w:color="000000" w:sz="4"/>
+              <w:right w:val="single" w:color="000000" w:sz="4"/>
+            </w:tcBorders>
+            <w:tcMar>
+              <w:top w:type="dxa" w:w="80"/>
+              <w:left w:type="dxa" w:w="100"/>
+              <w:bottom w:type="dxa" w:w="80"/>
+              <w:right w:type="dxa" w:w="100"/>
+            </w:tcMar>
+            <w:vAlign w:val="center"/>
+          </w:tcPr>
+          <w:p>
+            <w:pPr>
+              <w:jc w:val="left"/>
+            </w:pPr>
+            <w:r>
+              <w:rPr>
+                <w:b w:val="false"/>
+                <w:bCs w:val="false"/>
+                <w:sz w:val="20"/>
+                <w:szCs w:val="20"/>
+              </w:rPr>
+              <w:t xml:space="preserve">FR-DEF-05</w:t>
+            </w:r>
+          </w:p>
+        </w:tc>
+        <w:tc>
+          <w:tcPr>
+            <w:tcW w:type="dxa" w:w="4024"/>
+            <w:tcBorders>
+              <w:top w:val="single" w:color="000000" w:sz="4"/>
+              <w:left w:val="single" w:color="000000" w:sz="4"/>
+              <w:bottom w:val="single" w:color="000000" w:sz="4"/>
+              <w:right w:val="single" w:color="000000" w:sz="4"/>
+            </w:tcBorders>
+            <w:tcMar>
+              <w:top w:type="dxa" w:w="80"/>
+              <w:left w:type="dxa" w:w="100"/>
+              <w:bottom w:type="dxa" w:w="80"/>
+              <w:right w:type="dxa" w:w="100"/>
+            </w:tcMar>
+            <w:vAlign w:val="center"/>
+          </w:tcPr>
+          <w:p>
+            <w:pPr>
+              <w:jc w:val="left"/>
+            </w:pPr>
+            <w:r>
+              <w:rPr>
+                <w:b w:val="false"/>
+                <w:bCs w:val="false"/>
+                <w:sz w:val="20"/>
+                <w:szCs w:val="20"/>
+              </w:rPr>
+              <w:t xml:space="preserve">Cases where a feature is correctly selected for removal but the removal or healing fails should be tracked as a separate failure category, distinct from wrong feature selection.</w:t>
+            </w:r>
+          </w:p>
+        </w:tc>
+        <w:tc>
+          <w:tcPr>
+            <w:tcW w:type="dxa" w:w="1404"/>
+            <w:tcBorders>
+              <w:top w:val="single" w:color="000000" w:sz="4"/>
+              <w:left w:val="single" w:color="000000" w:sz="4"/>
+              <w:bottom w:val="single" w:color="000000" w:sz="4"/>
+              <w:right w:val="single" w:color="000000" w:sz="4"/>
+            </w:tcBorders>
+            <w:tcMar>
+              <w:top w:type="dxa" w:w="80"/>
+              <w:left w:type="dxa" w:w="100"/>
+              <w:bottom w:type="dxa" w:w="80"/>
+              <w:right w:type="dxa" w:w="100"/>
+            </w:tcMar>
+            <w:vAlign w:val="center"/>
+          </w:tcPr>
+          <w:p>
+            <w:pPr>
+              <w:jc w:val="center"/>
+            </w:pPr>
+            <w:r>
+              <w:rPr>
+                <w:b w:val="false"/>
+                <w:bCs w:val="false"/>
+                <w:sz w:val="20"/>
+                <w:szCs w:val="20"/>
+              </w:rPr>
+              <w:t xml:space="preserve">Want</w:t>
+            </w:r>
+          </w:p>
+        </w:tc>
+        <w:tc>
+          <w:tcPr>
+            <w:tcW w:type="dxa" w:w="1872"/>
+            <w:tcBorders>
+              <w:top w:val="single" w:color="000000" w:sz="4"/>
+              <w:left w:val="single" w:color="000000" w:sz="4"/>
+              <w:bottom w:val="single" w:color="000000" w:sz="4"/>
+              <w:right w:val="single" w:color="000000" w:sz="4"/>
+            </w:tcBorders>
+            <w:tcMar>
+              <w:top w:type="dxa" w:w="80"/>
+              <w:left w:type="dxa" w:w="100"/>
+              <w:bottom w:type="dxa" w:w="80"/>
+              <w:right w:type="dxa" w:w="100"/>
+            </w:tcMar>
+            <w:vAlign w:val="center"/>
+          </w:tcPr>
+          <w:p>
+            <w:pPr>
+              <w:jc w:val="left"/>
+            </w:pPr>
+            <w:r>
+              <w:rPr>
+                <w:b w:val="false"/>
+                <w:bCs w:val="false"/>
+                <w:sz w:val="20"/>
+                <w:szCs w:val="20"/>
+              </w:rPr>
+              <w:t xml:space="preserve">Suggested by HP mentor (reply to proposal, relayed 2026-10-02); unverified, team decision pending. Builds on FR-DEF-04; such cases can serve as training/validation data.</w:t>
             </w:r>
           </w:p>
         </w:tc>
@@ -4460,7 +5240,7 @@
                 <w:sz w:val="20"/>
                 <w:szCs w:val="20"/>
               </w:rPr>
-              <w:t xml:space="preserve">Junoh Lee</w:t>
+              <w:t xml:space="preserve">FR-VAL-07</w:t>
             </w:r>
           </w:p>
         </w:tc>
@@ -4492,7 +5272,7 @@
                 <w:sz w:val="20"/>
                 <w:szCs w:val="20"/>
               </w:rPr>
-              <w:t xml:space="preserve">2026-09-29</w:t>
+              <w:t xml:space="preserve">Defeaturing accuracy should be evaluated and reported as two separate categories: feature selection accuracy (were the correct faces/features selected) and removal execution accuracy (could the selected feature be removed and healed without geometry issues).</w:t>
             </w:r>
           </w:p>
         </w:tc>
@@ -4524,7 +5304,7 @@
                 <w:sz w:val="20"/>
                 <w:szCs w:val="20"/>
               </w:rPr>
-              <w:t xml:space="preserve">Full-document verification pass: cross-checked against the working src/cleancad_core.py prototype (9/9 self-authored example shapes pass headless verification); added prototype references to FR-IO-02, FR-DEF-01/02/04. No requirement content changed.</w:t>
+              <w:t xml:space="preserve">Want</w:t>
             </w:r>
           </w:p>
         </w:tc>
@@ -4556,7 +5336,7 @@
                 <w:sz w:val="20"/>
                 <w:szCs w:val="20"/>
               </w:rPr>
-              <w:t xml:space="preserve">1.7</w:t>
+              <w:t xml:space="preserve">Suggested by HP mentor (reply to proposal, relayed 2026-10-02); unverified, team decision pending.</w:t>
             </w:r>
           </w:p>
         </w:tc>
@@ -5116,6 +5896,136 @@
                 <w:szCs w:val="20"/>
               </w:rPr>
               <w:t xml:space="preserve">Confirmed with HP mentor 2026-09-18</w:t>
+            </w:r>
+          </w:p>
+        </w:tc>
+      </w:tr>
+      <w:tr>
+        <w:tc>
+          <w:tcPr>
+            <w:tcW w:type="dxa" w:w="2059"/>
+            <w:tcBorders>
+              <w:top w:val="single" w:color="000000" w:sz="4"/>
+              <w:left w:val="single" w:color="000000" w:sz="4"/>
+              <w:bottom w:val="single" w:color="000000" w:sz="4"/>
+              <w:right w:val="single" w:color="000000" w:sz="4"/>
+            </w:tcBorders>
+            <w:tcMar>
+              <w:top w:type="dxa" w:w="80"/>
+              <w:left w:type="dxa" w:w="100"/>
+              <w:bottom w:type="dxa" w:w="80"/>
+              <w:right w:type="dxa" w:w="100"/>
+            </w:tcMar>
+            <w:vAlign w:val="center"/>
+          </w:tcPr>
+          <w:p>
+            <w:pPr>
+              <w:jc w:val="left"/>
+            </w:pPr>
+            <w:r>
+              <w:rPr>
+                <w:b w:val="false"/>
+                <w:bCs w:val="false"/>
+                <w:sz w:val="20"/>
+                <w:szCs w:val="20"/>
+              </w:rPr>
+              <w:t xml:space="preserve">FR-DATA-04</w:t>
+            </w:r>
+          </w:p>
+        </w:tc>
+        <w:tc>
+          <w:tcPr>
+            <w:tcW w:type="dxa" w:w="4024"/>
+            <w:tcBorders>
+              <w:top w:val="single" w:color="000000" w:sz="4"/>
+              <w:left w:val="single" w:color="000000" w:sz="4"/>
+              <w:bottom w:val="single" w:color="000000" w:sz="4"/>
+              <w:right w:val="single" w:color="000000" w:sz="4"/>
+            </w:tcBorders>
+            <w:tcMar>
+              <w:top w:type="dxa" w:w="80"/>
+              <w:left w:type="dxa" w:w="100"/>
+              <w:bottom w:type="dxa" w:w="80"/>
+              <w:right w:type="dxa" w:w="100"/>
+            </w:tcMar>
+            <w:vAlign w:val="center"/>
+          </w:tcPr>
+          <w:p>
+            <w:pPr>
+              <w:jc w:val="left"/>
+            </w:pPr>
+            <w:r>
+              <w:rPr>
+                <w:b w:val="false"/>
+                <w:bCs w:val="false"/>
+                <w:sz w:val="20"/>
+                <w:szCs w:val="20"/>
+              </w:rPr>
+              <w:t xml:space="preserve">The validation dataset should be expanded beyond the initial nine self-authored shapes: greater geometric diversity, multiple feature-type combinations, harder edge cases, varied feature sizes and locations, and cases that intentionally trigger healing difficulties or removal failures.</w:t>
+            </w:r>
+          </w:p>
+        </w:tc>
+        <w:tc>
+          <w:tcPr>
+            <w:tcW w:type="dxa" w:w="1404"/>
+            <w:tcBorders>
+              <w:top w:val="single" w:color="000000" w:sz="4"/>
+              <w:left w:val="single" w:color="000000" w:sz="4"/>
+              <w:bottom w:val="single" w:color="000000" w:sz="4"/>
+              <w:right w:val="single" w:color="000000" w:sz="4"/>
+            </w:tcBorders>
+            <w:tcMar>
+              <w:top w:type="dxa" w:w="80"/>
+              <w:left w:type="dxa" w:w="100"/>
+              <w:bottom w:type="dxa" w:w="80"/>
+              <w:right w:type="dxa" w:w="100"/>
+            </w:tcMar>
+            <w:vAlign w:val="center"/>
+          </w:tcPr>
+          <w:p>
+            <w:pPr>
+              <w:jc w:val="center"/>
+            </w:pPr>
+            <w:r>
+              <w:rPr>
+                <w:b w:val="false"/>
+                <w:bCs w:val="false"/>
+                <w:sz w:val="20"/>
+                <w:szCs w:val="20"/>
+              </w:rPr>
+              <w:t xml:space="preserve">Want</w:t>
+            </w:r>
+          </w:p>
+        </w:tc>
+        <w:tc>
+          <w:tcPr>
+            <w:tcW w:type="dxa" w:w="1872"/>
+            <w:tcBorders>
+              <w:top w:val="single" w:color="000000" w:sz="4"/>
+              <w:left w:val="single" w:color="000000" w:sz="4"/>
+              <w:bottom w:val="single" w:color="000000" w:sz="4"/>
+              <w:right w:val="single" w:color="000000" w:sz="4"/>
+            </w:tcBorders>
+            <w:tcMar>
+              <w:top w:type="dxa" w:w="80"/>
+              <w:left w:type="dxa" w:w="100"/>
+              <w:bottom w:type="dxa" w:w="80"/>
+              <w:right w:type="dxa" w:w="100"/>
+            </w:tcMar>
+            <w:vAlign w:val="center"/>
+          </w:tcPr>
+          <w:p>
+            <w:pPr>
+              <w:jc w:val="left"/>
+            </w:pPr>
+            <w:r>
+              <w:rPr>
+                <w:b w:val="false"/>
+                <w:bCs w:val="false"/>
+                <w:sz w:val="20"/>
+                <w:szCs w:val="20"/>
+              </w:rPr>
+              <w:t xml:space="preserve">Suggested by HP mentor (reply to proposal, relayed 2026-10-02); unverified, team decision pending.</w:t>
             </w:r>
           </w:p>
         </w:tc>

</xml_diff>

<commit_message>
Update requirements after the professor's review and the HP mentor's reply
FRD v1.11 / NFRD v1.9: team name CleanCAD, NFR-USE-02 now Must, NFR-PERF-02 compares with
manual time (Must), FR-FEAT-05 reworded (no approval step inside the system), FR-VAL-03
reworded to measurable mesh statistics, initial thresholds (3/5/5 mm) in FR-FEAT-07,
logos (FR-FEAT-08) now Must, new FR-VAL-08 (face-selection review tool) and FR-DATA-05
(generated test data with face-level ground truth).
</commit_message>
<xml_diff>
--- a/docs/Functional_Requirements_Document.docx
+++ b/docs/Functional_Requirements_Document.docx
@@ -44,7 +44,7 @@
         <w:t xml:space="preserve">Team Name: </w:t>
       </w:r>
       <w:r>
-        <w:t xml:space="preserve">HP2</w:t>
+        <w:t xml:space="preserve">CleanCAD</w:t>
       </w:r>
     </w:p>
     <w:p>
@@ -1401,6 +1401,396 @@
           </w:p>
         </w:tc>
       </w:tr>
+      <w:tr>
+        <w:tc>
+          <w:tcPr>
+            <w:tcW w:type="dxa" w:w="2059"/>
+            <w:tcBorders>
+              <w:top w:val="single" w:color="000000" w:sz="4"/>
+              <w:left w:val="single" w:color="000000" w:sz="4"/>
+              <w:bottom w:val="single" w:color="000000" w:sz="4"/>
+              <w:right w:val="single" w:color="000000" w:sz="4"/>
+            </w:tcBorders>
+            <w:tcMar>
+              <w:top w:type="dxa" w:w="80"/>
+              <w:left w:type="dxa" w:w="100"/>
+              <w:bottom w:type="dxa" w:w="80"/>
+              <w:right w:type="dxa" w:w="100"/>
+            </w:tcMar>
+            <w:vAlign w:val="center"/>
+          </w:tcPr>
+          <w:p>
+            <w:pPr>
+              <w:jc w:val="left"/>
+            </w:pPr>
+            <w:r>
+              <w:rPr>
+                <w:b w:val="false"/>
+                <w:bCs w:val="false"/>
+                <w:sz w:val="20"/>
+                <w:szCs w:val="20"/>
+              </w:rPr>
+              <w:t xml:space="preserve">Junoh Lee</w:t>
+            </w:r>
+          </w:p>
+        </w:tc>
+        <w:tc>
+          <w:tcPr>
+            <w:tcW w:type="dxa" w:w="4024"/>
+            <w:tcBorders>
+              <w:top w:val="single" w:color="000000" w:sz="4"/>
+              <w:left w:val="single" w:color="000000" w:sz="4"/>
+              <w:bottom w:val="single" w:color="000000" w:sz="4"/>
+              <w:right w:val="single" w:color="000000" w:sz="4"/>
+            </w:tcBorders>
+            <w:tcMar>
+              <w:top w:type="dxa" w:w="80"/>
+              <w:left w:type="dxa" w:w="100"/>
+              <w:bottom w:type="dxa" w:w="80"/>
+              <w:right w:type="dxa" w:w="100"/>
+            </w:tcMar>
+            <w:vAlign w:val="center"/>
+          </w:tcPr>
+          <w:p>
+            <w:pPr>
+              <w:jc w:val="left"/>
+            </w:pPr>
+            <w:r>
+              <w:rPr>
+                <w:b w:val="false"/>
+                <w:bCs w:val="false"/>
+                <w:sz w:val="20"/>
+                <w:szCs w:val="20"/>
+              </w:rPr>
+              <w:t xml:space="preserve">2026-10-08</w:t>
+            </w:r>
+          </w:p>
+        </w:tc>
+        <w:tc>
+          <w:tcPr>
+            <w:tcW w:type="dxa" w:w="1404"/>
+            <w:tcBorders>
+              <w:top w:val="single" w:color="000000" w:sz="4"/>
+              <w:left w:val="single" w:color="000000" w:sz="4"/>
+              <w:bottom w:val="single" w:color="000000" w:sz="4"/>
+              <w:right w:val="single" w:color="000000" w:sz="4"/>
+            </w:tcBorders>
+            <w:tcMar>
+              <w:top w:type="dxa" w:w="80"/>
+              <w:left w:type="dxa" w:w="100"/>
+              <w:bottom w:type="dxa" w:w="80"/>
+              <w:right w:type="dxa" w:w="100"/>
+            </w:tcMar>
+            <w:vAlign w:val="center"/>
+          </w:tcPr>
+          <w:p>
+            <w:pPr>
+              <w:jc w:val="center"/>
+            </w:pPr>
+            <w:r>
+              <w:rPr>
+                <w:b w:val="false"/>
+                <w:bCs w:val="false"/>
+                <w:sz w:val="20"/>
+                <w:szCs w:val="20"/>
+              </w:rPr>
+              <w:t xml:space="preserve">Per professor's review: team name corrected to CleanCAD.</w:t>
+            </w:r>
+          </w:p>
+        </w:tc>
+        <w:tc>
+          <w:tcPr>
+            <w:tcW w:type="dxa" w:w="1872"/>
+            <w:tcBorders>
+              <w:top w:val="single" w:color="000000" w:sz="4"/>
+              <w:left w:val="single" w:color="000000" w:sz="4"/>
+              <w:bottom w:val="single" w:color="000000" w:sz="4"/>
+              <w:right w:val="single" w:color="000000" w:sz="4"/>
+            </w:tcBorders>
+            <w:tcMar>
+              <w:top w:type="dxa" w:w="80"/>
+              <w:left w:type="dxa" w:w="100"/>
+              <w:bottom w:type="dxa" w:w="80"/>
+              <w:right w:type="dxa" w:w="100"/>
+            </w:tcMar>
+            <w:vAlign w:val="center"/>
+          </w:tcPr>
+          <w:p>
+            <w:pPr>
+              <w:jc w:val="left"/>
+            </w:pPr>
+            <w:r>
+              <w:rPr>
+                <w:b w:val="false"/>
+                <w:bCs w:val="false"/>
+                <w:sz w:val="20"/>
+                <w:szCs w:val="20"/>
+              </w:rPr>
+              <w:t xml:space="preserve">1.9</w:t>
+            </w:r>
+          </w:p>
+        </w:tc>
+      </w:tr>
+      <w:tr>
+        <w:tc>
+          <w:tcPr>
+            <w:tcW w:type="dxa" w:w="2059"/>
+            <w:tcBorders>
+              <w:top w:val="single" w:color="000000" w:sz="4"/>
+              <w:left w:val="single" w:color="000000" w:sz="4"/>
+              <w:bottom w:val="single" w:color="000000" w:sz="4"/>
+              <w:right w:val="single" w:color="000000" w:sz="4"/>
+            </w:tcBorders>
+            <w:tcMar>
+              <w:top w:type="dxa" w:w="80"/>
+              <w:left w:type="dxa" w:w="100"/>
+              <w:bottom w:type="dxa" w:w="80"/>
+              <w:right w:type="dxa" w:w="100"/>
+            </w:tcMar>
+            <w:vAlign w:val="center"/>
+          </w:tcPr>
+          <w:p>
+            <w:pPr>
+              <w:jc w:val="left"/>
+            </w:pPr>
+            <w:r>
+              <w:rPr>
+                <w:b w:val="false"/>
+                <w:bCs w:val="false"/>
+                <w:sz w:val="20"/>
+                <w:szCs w:val="20"/>
+              </w:rPr>
+              <w:t xml:space="preserve">Junoh Lee</w:t>
+            </w:r>
+          </w:p>
+        </w:tc>
+        <w:tc>
+          <w:tcPr>
+            <w:tcW w:type="dxa" w:w="4024"/>
+            <w:tcBorders>
+              <w:top w:val="single" w:color="000000" w:sz="4"/>
+              <w:left w:val="single" w:color="000000" w:sz="4"/>
+              <w:bottom w:val="single" w:color="000000" w:sz="4"/>
+              <w:right w:val="single" w:color="000000" w:sz="4"/>
+            </w:tcBorders>
+            <w:tcMar>
+              <w:top w:type="dxa" w:w="80"/>
+              <w:left w:type="dxa" w:w="100"/>
+              <w:bottom w:type="dxa" w:w="80"/>
+              <w:right w:type="dxa" w:w="100"/>
+            </w:tcMar>
+            <w:vAlign w:val="center"/>
+          </w:tcPr>
+          <w:p>
+            <w:pPr>
+              <w:jc w:val="left"/>
+            </w:pPr>
+            <w:r>
+              <w:rPr>
+                <w:b w:val="false"/>
+                <w:bCs w:val="false"/>
+                <w:sz w:val="20"/>
+                <w:szCs w:val="20"/>
+              </w:rPr>
+              <w:t xml:space="preserve">2026-10-08</w:t>
+            </w:r>
+          </w:p>
+        </w:tc>
+        <w:tc>
+          <w:tcPr>
+            <w:tcW w:type="dxa" w:w="1404"/>
+            <w:tcBorders>
+              <w:top w:val="single" w:color="000000" w:sz="4"/>
+              <w:left w:val="single" w:color="000000" w:sz="4"/>
+              <w:bottom w:val="single" w:color="000000" w:sz="4"/>
+              <w:right w:val="single" w:color="000000" w:sz="4"/>
+            </w:tcBorders>
+            <w:tcMar>
+              <w:top w:type="dxa" w:w="80"/>
+              <w:left w:type="dxa" w:w="100"/>
+              <w:bottom w:type="dxa" w:w="80"/>
+              <w:right w:type="dxa" w:w="100"/>
+            </w:tcMar>
+            <w:vAlign w:val="center"/>
+          </w:tcPr>
+          <w:p>
+            <w:pPr>
+              <w:jc w:val="center"/>
+            </w:pPr>
+            <w:r>
+              <w:rPr>
+                <w:b w:val="false"/>
+                <w:bCs w:val="false"/>
+                <w:sz w:val="20"/>
+                <w:szCs w:val="20"/>
+              </w:rPr>
+              <w:t xml:space="preserve">Reviewed with Hemanth Reddy Vangala: FR-FEAT-05 reworded (no approval step inside the system; the HP engineer reviews the output and corrects mistakes); FR-VAL-03 reworded to measurable mesh statistics.</w:t>
+            </w:r>
+          </w:p>
+        </w:tc>
+        <w:tc>
+          <w:tcPr>
+            <w:tcW w:type="dxa" w:w="1872"/>
+            <w:tcBorders>
+              <w:top w:val="single" w:color="000000" w:sz="4"/>
+              <w:left w:val="single" w:color="000000" w:sz="4"/>
+              <w:bottom w:val="single" w:color="000000" w:sz="4"/>
+              <w:right w:val="single" w:color="000000" w:sz="4"/>
+            </w:tcBorders>
+            <w:tcMar>
+              <w:top w:type="dxa" w:w="80"/>
+              <w:left w:type="dxa" w:w="100"/>
+              <w:bottom w:type="dxa" w:w="80"/>
+              <w:right w:type="dxa" w:w="100"/>
+            </w:tcMar>
+            <w:vAlign w:val="center"/>
+          </w:tcPr>
+          <w:p>
+            <w:pPr>
+              <w:jc w:val="left"/>
+            </w:pPr>
+            <w:r>
+              <w:rPr>
+                <w:b w:val="false"/>
+                <w:bCs w:val="false"/>
+                <w:sz w:val="20"/>
+                <w:szCs w:val="20"/>
+              </w:rPr>
+              <w:t xml:space="preserve">1.10</w:t>
+            </w:r>
+          </w:p>
+        </w:tc>
+      </w:tr>
+      <w:tr>
+        <w:tc>
+          <w:tcPr>
+            <w:tcW w:type="dxa" w:w="2059"/>
+            <w:tcBorders>
+              <w:top w:val="single" w:color="000000" w:sz="4"/>
+              <w:left w:val="single" w:color="000000" w:sz="4"/>
+              <w:bottom w:val="single" w:color="000000" w:sz="4"/>
+              <w:right w:val="single" w:color="000000" w:sz="4"/>
+            </w:tcBorders>
+            <w:tcMar>
+              <w:top w:type="dxa" w:w="80"/>
+              <w:left w:type="dxa" w:w="100"/>
+              <w:bottom w:type="dxa" w:w="80"/>
+              <w:right w:type="dxa" w:w="100"/>
+            </w:tcMar>
+            <w:vAlign w:val="center"/>
+          </w:tcPr>
+          <w:p>
+            <w:pPr>
+              <w:jc w:val="left"/>
+            </w:pPr>
+            <w:r>
+              <w:rPr>
+                <w:b w:val="false"/>
+                <w:bCs w:val="false"/>
+                <w:sz w:val="20"/>
+                <w:szCs w:val="20"/>
+              </w:rPr>
+              <w:t xml:space="preserve">Junoh Lee</w:t>
+            </w:r>
+          </w:p>
+        </w:tc>
+        <w:tc>
+          <w:tcPr>
+            <w:tcW w:type="dxa" w:w="4024"/>
+            <w:tcBorders>
+              <w:top w:val="single" w:color="000000" w:sz="4"/>
+              <w:left w:val="single" w:color="000000" w:sz="4"/>
+              <w:bottom w:val="single" w:color="000000" w:sz="4"/>
+              <w:right w:val="single" w:color="000000" w:sz="4"/>
+            </w:tcBorders>
+            <w:tcMar>
+              <w:top w:type="dxa" w:w="80"/>
+              <w:left w:type="dxa" w:w="100"/>
+              <w:bottom w:type="dxa" w:w="80"/>
+              <w:right w:type="dxa" w:w="100"/>
+            </w:tcMar>
+            <w:vAlign w:val="center"/>
+          </w:tcPr>
+          <w:p>
+            <w:pPr>
+              <w:jc w:val="left"/>
+            </w:pPr>
+            <w:r>
+              <w:rPr>
+                <w:b w:val="false"/>
+                <w:bCs w:val="false"/>
+                <w:sz w:val="20"/>
+                <w:szCs w:val="20"/>
+              </w:rPr>
+              <w:t xml:space="preserve">2026-10-08</w:t>
+            </w:r>
+          </w:p>
+        </w:tc>
+        <w:tc>
+          <w:tcPr>
+            <w:tcW w:type="dxa" w:w="1404"/>
+            <w:tcBorders>
+              <w:top w:val="single" w:color="000000" w:sz="4"/>
+              <w:left w:val="single" w:color="000000" w:sz="4"/>
+              <w:bottom w:val="single" w:color="000000" w:sz="4"/>
+              <w:right w:val="single" w:color="000000" w:sz="4"/>
+            </w:tcBorders>
+            <w:tcMar>
+              <w:top w:type="dxa" w:w="80"/>
+              <w:left w:type="dxa" w:w="100"/>
+              <w:bottom w:type="dxa" w:w="80"/>
+              <w:right w:type="dxa" w:w="100"/>
+            </w:tcMar>
+            <w:vAlign w:val="center"/>
+          </w:tcPr>
+          <w:p>
+            <w:pPr>
+              <w:jc w:val="center"/>
+            </w:pPr>
+            <w:r>
+              <w:rPr>
+                <w:b w:val="false"/>
+                <w:bCs w:val="false"/>
+                <w:sz w:val="20"/>
+                <w:szCs w:val="20"/>
+              </w:rPr>
+              <w:t xml:space="preserve">Updated per the HP mentor's reply: FR-FEAT-07 initial thresholds (hole 3 mm, fillet 5 mm, chamfer 5 mm); FR-FEAT-08 (logos) raised to Must; FR-FEAT-05/06 and FR-DEF-04 prototype scope confirmed; added FR-VAL-08 (face-selection review tool) and FR-DATA-05 (programmatic test data with face-level ground truth).</w:t>
+            </w:r>
+          </w:p>
+        </w:tc>
+        <w:tc>
+          <w:tcPr>
+            <w:tcW w:type="dxa" w:w="1872"/>
+            <w:tcBorders>
+              <w:top w:val="single" w:color="000000" w:sz="4"/>
+              <w:left w:val="single" w:color="000000" w:sz="4"/>
+              <w:bottom w:val="single" w:color="000000" w:sz="4"/>
+              <w:right w:val="single" w:color="000000" w:sz="4"/>
+            </w:tcBorders>
+            <w:tcMar>
+              <w:top w:type="dxa" w:w="80"/>
+              <w:left w:type="dxa" w:w="100"/>
+              <w:bottom w:type="dxa" w:w="80"/>
+              <w:right w:type="dxa" w:w="100"/>
+            </w:tcMar>
+            <w:vAlign w:val="center"/>
+          </w:tcPr>
+          <w:p>
+            <w:pPr>
+              <w:jc w:val="left"/>
+            </w:pPr>
+            <w:r>
+              <w:rPr>
+                <w:b w:val="false"/>
+                <w:bCs w:val="false"/>
+                <w:sz w:val="20"/>
+                <w:szCs w:val="20"/>
+              </w:rPr>
+              <w:t xml:space="preserve">1.11</w:t>
+            </w:r>
+          </w:p>
+        </w:tc>
+      </w:tr>
     </w:tbl>
     <w:p>
       <w:pPr>
@@ -2398,7 +2788,7 @@
                 <w:sz w:val="20"/>
                 <w:szCs w:val="20"/>
               </w:rPr>
-              <w:t xml:space="preserve"/>
+              <w:t xml:space="preserve">Per the HP mentor's reply of 2026-10-08: the reliability of rule-based geometry checks for ribs, bosses, embossing and logos is uncertain; the team is asked to evaluate this approach.</w:t>
             </w:r>
           </w:p>
         </w:tc>
@@ -2854,7 +3244,7 @@
                 <w:sz w:val="20"/>
                 <w:szCs w:val="20"/>
               </w:rPr>
-              <w:t xml:space="preserve">The system shall present all proposed feature-removal decisions to the engineer for review before finalizing the output; the system assists but does not replace engineer judgment.</w:t>
+              <w:t xml:space="preserve">The system shall provide the engineer with the information needed to review the result (the before/after visualization, the faces selected for removal, and the removed-feature metadata). The review itself, and any correction of mistakes, is performed by the HP engineer after the system output, outside the system.</w:t>
             </w:r>
           </w:p>
         </w:tc>
@@ -2918,7 +3308,7 @@
                 <w:sz w:val="20"/>
                 <w:szCs w:val="20"/>
               </w:rPr>
-              <w:t xml:space="preserve">Confirmed: engineer review is unavoidable for every result, not only low-confidence cases</w:t>
+              <w:t xml:space="preserve">Reworded 2026-10-08: there is no approval step inside the system; the system produces the complete result and the HP engineer reviews it and corrects any mistakes manually. Replaces the earlier wording "present all proposed feature-removal decisions to the engineer for review before finalizing the output". Review outside the software is acceptable to the HP mentor (reply of 2026-10-08).</w:t>
             </w:r>
           </w:p>
         </w:tc>
@@ -3048,7 +3438,7 @@
                 <w:sz w:val="20"/>
                 <w:szCs w:val="20"/>
               </w:rPr>
-              <w:t xml:space="preserve">Confirmed with HP mentor 2026-09-18</w:t>
+              <w:t xml:space="preserve">Confirmed with HP mentor 2026-09-18 Prototype scope confirmed by the HP mentor (reply of 2026-10-08): ML is used for feature recognition and the removal decision is rule-based; ML-based removal decisions are moved to a later stage.</w:t>
             </w:r>
           </w:p>
         </w:tc>
@@ -3114,7 +3504,7 @@
                 <w:sz w:val="20"/>
                 <w:szCs w:val="20"/>
               </w:rPr>
-              <w:t xml:space="preserve">Stage 1 rule-based decisions should use explicit, configurable dimension thresholds (e.g., hole diameter, chamfer size, fillet radius) so that decisions remain explainable.</w:t>
+              <w:t xml:space="preserve">Stage 1 rule-based decisions shall use explicit, configurable dimension thresholds so that decisions remain explainable. The initial thresholds for evaluating removal candidates are: hole diameter 3 mm, fillet radius 5 mm and chamfer size 5 mm. The values can be adjusted case by case.</w:t>
             </w:r>
           </w:p>
         </w:tc>
@@ -3146,7 +3536,7 @@
                 <w:sz w:val="20"/>
                 <w:szCs w:val="20"/>
               </w:rPr>
-              <w:t xml:space="preserve">Want</w:t>
+              <w:t xml:space="preserve">Must</w:t>
             </w:r>
           </w:p>
         </w:tc>
@@ -3178,7 +3568,7 @@
                 <w:sz w:val="20"/>
                 <w:szCs w:val="20"/>
               </w:rPr>
-              <w:t xml:space="preserve">Suggested by HP mentor (reply to proposal, relayed 2026-10-02); unverified, team decision pending. Threshold values are to be defined by the team.</w:t>
+              <w:t xml:space="preserve">Initial values given by the HP mentor (reply of 2026-10-08). Our reading is that features smaller than a threshold are removal candidates; to be confirmed.</w:t>
             </w:r>
           </w:p>
         </w:tc>
@@ -3244,7 +3634,7 @@
                 <w:sz w:val="20"/>
                 <w:szCs w:val="20"/>
               </w:rPr>
-              <w:t xml:space="preserve">The system should support logos (characters, surface markings, embossed or engraved text) as an additional feature category for defeaturing.</w:t>
+              <w:t xml:space="preserve">The system shall support logos (characters, surface markings, and embossed or engraved logos) as a feature category for recognition and removal.</w:t>
             </w:r>
           </w:p>
         </w:tc>
@@ -3276,7 +3666,7 @@
                 <w:sz w:val="20"/>
                 <w:szCs w:val="20"/>
               </w:rPr>
-              <w:t xml:space="preserve">Want</w:t>
+              <w:t xml:space="preserve">Must</w:t>
             </w:r>
           </w:p>
         </w:tc>
@@ -3308,7 +3698,7 @@
                 <w:sz w:val="20"/>
                 <w:szCs w:val="20"/>
               </w:rPr>
-              <w:t xml:space="preserve">Suggested by HP mentor (reply to proposal, relayed 2026-10-02); unverified, team decision pending. Scope open: HP's initially named shape types remain the priority; relation to the existing emboss type to be clarified.</w:t>
+              <w:t xml:space="preserve">High priority per the HP mentor's reply of 2026-10-08. Relation to the existing emboss type to be clarified. Pretrained models do not cover logos, so the recognition approach (rule-based geometry checks) is to be evaluated.</w:t>
             </w:r>
           </w:p>
         </w:tc>
@@ -3438,7 +3828,7 @@
                 <w:sz w:val="20"/>
                 <w:szCs w:val="20"/>
               </w:rPr>
-              <w:t xml:space="preserve">Suggested by HP mentor (reply to proposal, relayed 2026-10-02); unverified, team decision pending. Design open (affects M4).</w:t>
+              <w:t xml:space="preserve">Suggested by HP mentor (reply to proposal, relayed 2026-10-02); unverified, team decision pending. Design open (affects M4). Becomes relevant when ML-based removal decisions are added in a later stage.</w:t>
             </w:r>
           </w:p>
         </w:tc>
@@ -4127,7 +4517,7 @@
                 <w:sz w:val="20"/>
                 <w:szCs w:val="20"/>
               </w:rPr>
-              <w:t xml:space="preserve">Confirmed with HP mentor 2026-09-18: corrected cases feed back into Stage 2 retraining (FR-FEAT-06) Silent-failure detection + storage prototyped in src/cleancad_core.py's remove_group()/process().</w:t>
+              <w:t xml:space="preserve">Confirmed with HP mentor 2026-09-18: corrected cases feed back into Stage 2 retraining (FR-FEAT-06) Silent-failure detection + storage prototyped in src/cleancad_core.py's remove_group()/process(). Prototype scope confirmed by the HP mentor (reply of 2026-10-08): failure cases are stored and retraining is left for a later stage.</w:t>
             </w:r>
           </w:p>
         </w:tc>
@@ -4752,7 +5142,7 @@
                 <w:sz w:val="20"/>
                 <w:szCs w:val="20"/>
               </w:rPr>
-              <w:t xml:space="preserve">The system shall evaluate mesh quality (e.g., element count, generation time) of the original and defeatured models to measure processing-time improvement.</w:t>
+              <w:t xml:space="preserve">The system shall evaluate the meshes generated from the original and the defeatured models using Gmsh and report measurable mesh statistics (for example element count and mesh generation time), to quantify the processing-time improvement.</w:t>
             </w:r>
           </w:p>
         </w:tc>
@@ -4816,7 +5206,7 @@
                 <w:sz w:val="20"/>
                 <w:szCs w:val="20"/>
               </w:rPr>
-              <w:t xml:space="preserve">Efficiency success criterion: 70-90% preprocessing time reduction. Secondary to defeaturing accuracy [see FR-VAL-05], the primary criterion</w:t>
+              <w:t xml:space="preserve">Efficiency success criterion: 70-90% preprocessing time reduction. Secondary to defeaturing accuracy [see FR-VAL-05], the primary criterion Reworded from "mesh quality" to measurable mesh statistics; element-quality criteria are not defined yet and are follow-up work. This is an evaluation activity, not a runtime module.</w:t>
             </w:r>
           </w:p>
         </w:tc>
@@ -5337,6 +5727,136 @@
                 <w:szCs w:val="20"/>
               </w:rPr>
               <w:t xml:space="preserve">Suggested by HP mentor (reply to proposal, relayed 2026-10-02); unverified, team decision pending.</w:t>
+            </w:r>
+          </w:p>
+        </w:tc>
+      </w:tr>
+      <w:tr>
+        <w:tc>
+          <w:tcPr>
+            <w:tcW w:type="dxa" w:w="2059"/>
+            <w:tcBorders>
+              <w:top w:val="single" w:color="000000" w:sz="4"/>
+              <w:left w:val="single" w:color="000000" w:sz="4"/>
+              <w:bottom w:val="single" w:color="000000" w:sz="4"/>
+              <w:right w:val="single" w:color="000000" w:sz="4"/>
+            </w:tcBorders>
+            <w:tcMar>
+              <w:top w:type="dxa" w:w="80"/>
+              <w:left w:type="dxa" w:w="100"/>
+              <w:bottom w:type="dxa" w:w="80"/>
+              <w:right w:type="dxa" w:w="100"/>
+            </w:tcMar>
+            <w:vAlign w:val="center"/>
+          </w:tcPr>
+          <w:p>
+            <w:pPr>
+              <w:jc w:val="left"/>
+            </w:pPr>
+            <w:r>
+              <w:rPr>
+                <w:b w:val="false"/>
+                <w:bCs w:val="false"/>
+                <w:sz w:val="20"/>
+                <w:szCs w:val="20"/>
+              </w:rPr>
+              <w:t xml:space="preserve">FR-VAL-08</w:t>
+            </w:r>
+          </w:p>
+        </w:tc>
+        <w:tc>
+          <w:tcPr>
+            <w:tcW w:type="dxa" w:w="4024"/>
+            <w:tcBorders>
+              <w:top w:val="single" w:color="000000" w:sz="4"/>
+              <w:left w:val="single" w:color="000000" w:sz="4"/>
+              <w:bottom w:val="single" w:color="000000" w:sz="4"/>
+              <w:right w:val="single" w:color="000000" w:sz="4"/>
+            </w:tcBorders>
+            <w:tcMar>
+              <w:top w:type="dxa" w:w="80"/>
+              <w:left w:type="dxa" w:w="100"/>
+              <w:bottom w:type="dxa" w:w="80"/>
+              <w:right w:type="dxa" w:w="100"/>
+            </w:tcMar>
+            <w:vAlign w:val="center"/>
+          </w:tcPr>
+          <w:p>
+            <w:pPr>
+              <w:jc w:val="left"/>
+            </w:pPr>
+            <w:r>
+              <w:rPr>
+                <w:b w:val="false"/>
+                <w:bCs w:val="false"/>
+                <w:sz w:val="20"/>
+                <w:szCs w:val="20"/>
+              </w:rPr>
+              <w:t xml:space="preserve">The system should provide a software tool with which the engineer can view the processed STEP model with the selected faces highlighted, correct the selection of faces to remove, and save the face-selection labels for future training.</w:t>
+            </w:r>
+          </w:p>
+        </w:tc>
+        <w:tc>
+          <w:tcPr>
+            <w:tcW w:type="dxa" w:w="1404"/>
+            <w:tcBorders>
+              <w:top w:val="single" w:color="000000" w:sz="4"/>
+              <w:left w:val="single" w:color="000000" w:sz="4"/>
+              <w:bottom w:val="single" w:color="000000" w:sz="4"/>
+              <w:right w:val="single" w:color="000000" w:sz="4"/>
+            </w:tcBorders>
+            <w:tcMar>
+              <w:top w:type="dxa" w:w="80"/>
+              <w:left w:type="dxa" w:w="100"/>
+              <w:bottom w:type="dxa" w:w="80"/>
+              <w:right w:type="dxa" w:w="100"/>
+            </w:tcMar>
+            <w:vAlign w:val="center"/>
+          </w:tcPr>
+          <w:p>
+            <w:pPr>
+              <w:jc w:val="center"/>
+            </w:pPr>
+            <w:r>
+              <w:rPr>
+                <w:b w:val="false"/>
+                <w:bCs w:val="false"/>
+                <w:sz w:val="20"/>
+                <w:szCs w:val="20"/>
+              </w:rPr>
+              <w:t xml:space="preserve">Want</w:t>
+            </w:r>
+          </w:p>
+        </w:tc>
+        <w:tc>
+          <w:tcPr>
+            <w:tcW w:type="dxa" w:w="1872"/>
+            <w:tcBorders>
+              <w:top w:val="single" w:color="000000" w:sz="4"/>
+              <w:left w:val="single" w:color="000000" w:sz="4"/>
+              <w:bottom w:val="single" w:color="000000" w:sz="4"/>
+              <w:right w:val="single" w:color="000000" w:sz="4"/>
+            </w:tcBorders>
+            <w:tcMar>
+              <w:top w:type="dxa" w:w="80"/>
+              <w:left w:type="dxa" w:w="100"/>
+              <w:bottom w:type="dxa" w:w="80"/>
+              <w:right w:type="dxa" w:w="100"/>
+            </w:tcMar>
+            <w:vAlign w:val="center"/>
+          </w:tcPr>
+          <w:p>
+            <w:pPr>
+              <w:jc w:val="left"/>
+            </w:pPr>
+            <w:r>
+              <w:rPr>
+                <w:b w:val="false"/>
+                <w:bCs w:val="false"/>
+                <w:sz w:val="20"/>
+                <w:szCs w:val="20"/>
+              </w:rPr>
+              <w:t xml:space="preserve">Suggested by the HP mentor (reply of 2026-10-08, "may need"). Builds on FR-VAL-06 and the failure records of FR-DEF-04; the saved labels are for later training.</w:t>
             </w:r>
           </w:p>
         </w:tc>
@@ -5635,7 +6155,7 @@
                 <w:sz w:val="20"/>
                 <w:szCs w:val="20"/>
               </w:rPr>
-              <w:t xml:space="preserve"/>
+              <w:t xml:space="preserve">A pretrained model is acceptable for initial testing (reply of 2026-10-08); no pretrained model specific to plastic-part features is known to the mentor.</w:t>
             </w:r>
           </w:p>
         </w:tc>
@@ -6026,6 +6546,136 @@
                 <w:szCs w:val="20"/>
               </w:rPr>
               <w:t xml:space="preserve">Suggested by HP mentor (reply to proposal, relayed 2026-10-02); unverified, team decision pending.</w:t>
+            </w:r>
+          </w:p>
+        </w:tc>
+      </w:tr>
+      <w:tr>
+        <w:tc>
+          <w:tcPr>
+            <w:tcW w:type="dxa" w:w="2059"/>
+            <w:tcBorders>
+              <w:top w:val="single" w:color="000000" w:sz="4"/>
+              <w:left w:val="single" w:color="000000" w:sz="4"/>
+              <w:bottom w:val="single" w:color="000000" w:sz="4"/>
+              <w:right w:val="single" w:color="000000" w:sz="4"/>
+            </w:tcBorders>
+            <w:tcMar>
+              <w:top w:type="dxa" w:w="80"/>
+              <w:left w:type="dxa" w:w="100"/>
+              <w:bottom w:type="dxa" w:w="80"/>
+              <w:right w:type="dxa" w:w="100"/>
+            </w:tcMar>
+            <w:vAlign w:val="center"/>
+          </w:tcPr>
+          <w:p>
+            <w:pPr>
+              <w:jc w:val="left"/>
+            </w:pPr>
+            <w:r>
+              <w:rPr>
+                <w:b w:val="false"/>
+                <w:bCs w:val="false"/>
+                <w:sz w:val="20"/>
+                <w:szCs w:val="20"/>
+              </w:rPr>
+              <w:t xml:space="preserve">FR-DATA-05</w:t>
+            </w:r>
+          </w:p>
+        </w:tc>
+        <w:tc>
+          <w:tcPr>
+            <w:tcW w:type="dxa" w:w="4024"/>
+            <w:tcBorders>
+              <w:top w:val="single" w:color="000000" w:sz="4"/>
+              <w:left w:val="single" w:color="000000" w:sz="4"/>
+              <w:bottom w:val="single" w:color="000000" w:sz="4"/>
+              <w:right w:val="single" w:color="000000" w:sz="4"/>
+            </w:tcBorders>
+            <w:tcMar>
+              <w:top w:type="dxa" w:w="80"/>
+              <w:left w:type="dxa" w:w="100"/>
+              <w:bottom w:type="dxa" w:w="80"/>
+              <w:right w:type="dxa" w:w="100"/>
+            </w:tcMar>
+            <w:vAlign w:val="center"/>
+          </w:tcPr>
+          <w:p>
+            <w:pPr>
+              <w:jc w:val="left"/>
+            </w:pPr>
+            <w:r>
+              <w:rPr>
+                <w:b w:val="false"/>
+                <w:bCs w:val="false"/>
+                <w:sz w:val="20"/>
+                <w:szCs w:val="20"/>
+              </w:rPr>
+              <w:t xml:space="preserve">The team should generate test STEP models programmatically by adding features through code and record the faces of each added feature as face-level ground truth, so that the face predictions can be checked automatically.</w:t>
+            </w:r>
+          </w:p>
+        </w:tc>
+        <w:tc>
+          <w:tcPr>
+            <w:tcW w:type="dxa" w:w="1404"/>
+            <w:tcBorders>
+              <w:top w:val="single" w:color="000000" w:sz="4"/>
+              <w:left w:val="single" w:color="000000" w:sz="4"/>
+              <w:bottom w:val="single" w:color="000000" w:sz="4"/>
+              <w:right w:val="single" w:color="000000" w:sz="4"/>
+            </w:tcBorders>
+            <w:tcMar>
+              <w:top w:type="dxa" w:w="80"/>
+              <w:left w:type="dxa" w:w="100"/>
+              <w:bottom w:type="dxa" w:w="80"/>
+              <w:right w:type="dxa" w:w="100"/>
+            </w:tcMar>
+            <w:vAlign w:val="center"/>
+          </w:tcPr>
+          <w:p>
+            <w:pPr>
+              <w:jc w:val="center"/>
+            </w:pPr>
+            <w:r>
+              <w:rPr>
+                <w:b w:val="false"/>
+                <w:bCs w:val="false"/>
+                <w:sz w:val="20"/>
+                <w:szCs w:val="20"/>
+              </w:rPr>
+              <w:t xml:space="preserve">Want</w:t>
+            </w:r>
+          </w:p>
+        </w:tc>
+        <w:tc>
+          <w:tcPr>
+            <w:tcW w:type="dxa" w:w="1872"/>
+            <w:tcBorders>
+              <w:top w:val="single" w:color="000000" w:sz="4"/>
+              <w:left w:val="single" w:color="000000" w:sz="4"/>
+              <w:bottom w:val="single" w:color="000000" w:sz="4"/>
+              <w:right w:val="single" w:color="000000" w:sz="4"/>
+            </w:tcBorders>
+            <w:tcMar>
+              <w:top w:type="dxa" w:w="80"/>
+              <w:left w:type="dxa" w:w="100"/>
+              <w:bottom w:type="dxa" w:w="80"/>
+              <w:right w:type="dxa" w:w="100"/>
+            </w:tcMar>
+            <w:vAlign w:val="center"/>
+          </w:tcPr>
+          <w:p>
+            <w:pPr>
+              <w:jc w:val="left"/>
+            </w:pPr>
+            <w:r>
+              <w:rPr>
+                <w:b w:val="false"/>
+                <w:bCs w:val="false"/>
+                <w:sz w:val="20"/>
+                <w:szCs w:val="20"/>
+              </w:rPr>
+              <w:t xml:space="preserve">The mentor's original understanding of the approach (reply of 2026-10-08). The dataset he pointed to (MFCAD-VLM) has no face-level labels, so without generated ground truth manual labeling would be needed.</w:t>
             </w:r>
           </w:p>
         </w:tc>

</xml_diff>